<commit_message>
Update analisis part 1
</commit_message>
<xml_diff>
--- a/analisis/Borrador.docx
+++ b/analisis/Borrador.docx
@@ -9,46 +9,132 @@
           <w:b/>
           <w:bCs/>
           <w:u w:val="single"/>
-          <w:lang w:val="en-GB"/>
-        </w:rPr>
-      </w:pPr>
-      <w:proofErr w:type="spellStart"/>
+        </w:rPr>
+      </w:pPr>
       <w:r>
         <w:rPr>
           <w:rFonts w:ascii="Times New Roman" w:hAnsi="Times New Roman" w:cs="Times New Roman"/>
           <w:b/>
           <w:bCs/>
           <w:u w:val="single"/>
-          <w:lang w:val="en-GB"/>
-        </w:rPr>
-        <w:t>Borrador</w:t>
-      </w:r>
-      <w:proofErr w:type="spellEnd"/>
+        </w:rPr>
+        <w:t xml:space="preserve">Borrador </w:t>
+      </w:r>
       <w:r>
         <w:rPr>
           <w:rFonts w:ascii="Times New Roman" w:hAnsi="Times New Roman" w:cs="Times New Roman"/>
           <w:b/>
           <w:bCs/>
           <w:u w:val="single"/>
-          <w:lang w:val="en-GB"/>
-        </w:rPr>
-        <w:t xml:space="preserve"> </w:t>
+        </w:rPr>
+        <w:t>– Elaborado por Lariza S</w:t>
+      </w:r>
+      <w:r>
+        <w:rPr>
+          <w:rFonts w:ascii="Times New Roman" w:hAnsi="Times New Roman" w:cs="Times New Roman"/>
+          <w:b/>
+          <w:bCs/>
+          <w:u w:val="single"/>
+        </w:rPr>
+        <w:t>andoval</w:t>
       </w:r>
     </w:p>
     <w:p>
       <w:pPr>
         <w:rPr>
           <w:rFonts w:ascii="Times New Roman" w:hAnsi="Times New Roman" w:cs="Times New Roman"/>
-          <w:lang w:val="en-GB"/>
-        </w:rPr>
-      </w:pPr>
-      <w:r>
-        <w:rPr>
-          <w:rFonts w:ascii="Times New Roman" w:hAnsi="Times New Roman" w:cs="Times New Roman"/>
-          <w:lang w:val="en-GB"/>
-        </w:rPr>
-        <w:t>Analysis Lossless Compression of Classification Map Images</w:t>
-      </w:r>
+        </w:rPr>
+      </w:pPr>
+      <w:r>
+        <w:rPr>
+          <w:rFonts w:ascii="Times New Roman" w:hAnsi="Times New Roman" w:cs="Times New Roman"/>
+        </w:rPr>
+        <w:t>Análisis -</w:t>
+      </w:r>
+      <w:r>
+        <w:rPr>
+          <w:rFonts w:ascii="Times New Roman" w:hAnsi="Times New Roman" w:cs="Times New Roman"/>
+        </w:rPr>
+        <w:t xml:space="preserve"> </w:t>
+      </w:r>
+      <w:proofErr w:type="spellStart"/>
+      <w:r>
+        <w:rPr>
+          <w:rFonts w:ascii="Times New Roman" w:hAnsi="Times New Roman" w:cs="Times New Roman"/>
+        </w:rPr>
+        <w:t>Lossless</w:t>
+      </w:r>
+      <w:proofErr w:type="spellEnd"/>
+      <w:r>
+        <w:rPr>
+          <w:rFonts w:ascii="Times New Roman" w:hAnsi="Times New Roman" w:cs="Times New Roman"/>
+        </w:rPr>
+        <w:t xml:space="preserve"> </w:t>
+      </w:r>
+      <w:proofErr w:type="spellStart"/>
+      <w:r>
+        <w:rPr>
+          <w:rFonts w:ascii="Times New Roman" w:hAnsi="Times New Roman" w:cs="Times New Roman"/>
+        </w:rPr>
+        <w:t>Compression</w:t>
+      </w:r>
+      <w:proofErr w:type="spellEnd"/>
+      <w:r>
+        <w:rPr>
+          <w:rFonts w:ascii="Times New Roman" w:hAnsi="Times New Roman" w:cs="Times New Roman"/>
+        </w:rPr>
+        <w:t xml:space="preserve"> </w:t>
+      </w:r>
+      <w:proofErr w:type="spellStart"/>
+      <w:r>
+        <w:rPr>
+          <w:rFonts w:ascii="Times New Roman" w:hAnsi="Times New Roman" w:cs="Times New Roman"/>
+        </w:rPr>
+        <w:t>of</w:t>
+      </w:r>
+      <w:proofErr w:type="spellEnd"/>
+      <w:r>
+        <w:rPr>
+          <w:rFonts w:ascii="Times New Roman" w:hAnsi="Times New Roman" w:cs="Times New Roman"/>
+        </w:rPr>
+        <w:t xml:space="preserve"> </w:t>
+      </w:r>
+      <w:proofErr w:type="spellStart"/>
+      <w:r>
+        <w:rPr>
+          <w:rFonts w:ascii="Times New Roman" w:hAnsi="Times New Roman" w:cs="Times New Roman"/>
+        </w:rPr>
+        <w:t>Classification</w:t>
+      </w:r>
+      <w:proofErr w:type="spellEnd"/>
+      <w:r>
+        <w:rPr>
+          <w:rFonts w:ascii="Times New Roman" w:hAnsi="Times New Roman" w:cs="Times New Roman"/>
+        </w:rPr>
+        <w:t xml:space="preserve"> </w:t>
+      </w:r>
+      <w:proofErr w:type="spellStart"/>
+      <w:r>
+        <w:rPr>
+          <w:rFonts w:ascii="Times New Roman" w:hAnsi="Times New Roman" w:cs="Times New Roman"/>
+        </w:rPr>
+        <w:t>Map</w:t>
+      </w:r>
+      <w:proofErr w:type="spellEnd"/>
+      <w:r>
+        <w:rPr>
+          <w:rFonts w:ascii="Times New Roman" w:hAnsi="Times New Roman" w:cs="Times New Roman"/>
+        </w:rPr>
+        <w:t xml:space="preserve"> </w:t>
+      </w:r>
+      <w:proofErr w:type="spellStart"/>
+      <w:r>
+        <w:rPr>
+          <w:rFonts w:ascii="Times New Roman" w:hAnsi="Times New Roman" w:cs="Times New Roman"/>
+        </w:rPr>
+        <w:t>Images</w:t>
+      </w:r>
+      <w:proofErr w:type="spellEnd"/>
     </w:p>
     <w:p>
       <w:pPr>
@@ -66,7 +152,7 @@
         <w:rPr>
           <w:rFonts w:ascii="Times New Roman" w:hAnsi="Times New Roman" w:cs="Times New Roman"/>
         </w:rPr>
-        <w:t xml:space="preserve"> en</w:t>
+        <w:t xml:space="preserve"> realiza en base a</w:t>
       </w:r>
       <w:r>
         <w:rPr>
@@ -145,6 +231,54 @@
             </a:graphic>
           </wp:inline>
         </w:drawing>
+      </w:r>
+    </w:p>
+    <w:p>
+      <w:pPr>
+        <w:rPr>
+          <w:rFonts w:ascii="Times New Roman" w:hAnsi="Times New Roman" w:cs="Times New Roman"/>
+          <w:b/>
+          <w:bCs/>
+          <w:u w:val="single"/>
+        </w:rPr>
+      </w:pPr>
+      <w:r>
+        <w:rPr>
+          <w:rFonts w:ascii="Times New Roman" w:hAnsi="Times New Roman" w:cs="Times New Roman"/>
+          <w:b/>
+          <w:bCs/>
+          <w:u w:val="single"/>
+        </w:rPr>
+        <w:t xml:space="preserve">Diferencias de resultados </w:t>
+      </w:r>
+      <w:r>
+        <w:rPr>
+          <w:rFonts w:ascii="Times New Roman" w:hAnsi="Times New Roman" w:cs="Times New Roman"/>
+          <w:b/>
+          <w:bCs/>
+          <w:u w:val="single"/>
+        </w:rPr>
+        <w:t xml:space="preserve">pipeline replicado vs </w:t>
+      </w:r>
+      <w:proofErr w:type="spellStart"/>
+      <w:r>
+        <w:rPr>
+          <w:rFonts w:ascii="Times New Roman" w:hAnsi="Times New Roman" w:cs="Times New Roman"/>
+          <w:b/>
+          <w:bCs/>
+          <w:u w:val="single"/>
+        </w:rPr>
+        <w:t>paper</w:t>
+      </w:r>
+      <w:proofErr w:type="spellEnd"/>
+      <w:r>
+        <w:rPr>
+          <w:rFonts w:ascii="Times New Roman" w:hAnsi="Times New Roman" w:cs="Times New Roman"/>
+          <w:b/>
+          <w:bCs/>
+          <w:u w:val="single"/>
+        </w:rPr>
+        <w:t xml:space="preserve"> </w:t>
       </w:r>
     </w:p>
     <w:p>
@@ -1299,7 +1433,7 @@
         <w:rPr>
           <w:rFonts w:ascii="Times New Roman" w:hAnsi="Times New Roman" w:cs="Times New Roman"/>
         </w:rPr>
-        <w:t xml:space="preserve"> original y los obtenidos con el pipeline implementado, para los cinco mapas de clasificación. En todos los casos los valores obtenidos son ligeramente superiores a los del </w:t>
+        <w:t xml:space="preserve"> original y los obtenidos con el pipeline implementado. En todos los casos los valores obtenidos son ligeramente superiores a los del </w:t>
       </w:r>
       <w:proofErr w:type="spellStart"/>
       <w:r>
@@ -1380,6 +1514,65 @@
           <w:rFonts w:ascii="Times New Roman" w:hAnsi="Times New Roman" w:cs="Times New Roman"/>
         </w:rPr>
         <w:t xml:space="preserve"> (pendiente de ver)</w:t>
+      </w:r>
+    </w:p>
+    <w:p>
+      <w:pPr>
+        <w:rPr>
+          <w:rFonts w:ascii="Times New Roman" w:hAnsi="Times New Roman" w:cs="Times New Roman"/>
+          <w:b/>
+          <w:bCs/>
+          <w:u w:val="single"/>
+        </w:rPr>
+      </w:pPr>
+      <w:r>
+        <w:rPr>
+          <w:rFonts w:ascii="Times New Roman" w:hAnsi="Times New Roman" w:cs="Times New Roman"/>
+          <w:b/>
+          <w:bCs/>
+          <w:u w:val="single"/>
+        </w:rPr>
+        <w:t xml:space="preserve">Análisis de la ganancia en la implementación de un </w:t>
+      </w:r>
+      <w:proofErr w:type="spellStart"/>
+      <w:r>
+        <w:rPr>
+          <w:rFonts w:ascii="Times New Roman" w:hAnsi="Times New Roman" w:cs="Times New Roman"/>
+          <w:b/>
+          <w:bCs/>
+          <w:u w:val="single"/>
+        </w:rPr>
+        <w:t>context</w:t>
+      </w:r>
+      <w:proofErr w:type="spellEnd"/>
+      <w:r>
+        <w:rPr>
+          <w:rFonts w:ascii="Times New Roman" w:hAnsi="Times New Roman" w:cs="Times New Roman"/>
+          <w:b/>
+          <w:bCs/>
+          <w:u w:val="single"/>
+        </w:rPr>
+        <w:t xml:space="preserve"> </w:t>
+      </w:r>
+      <w:proofErr w:type="spellStart"/>
+      <w:r>
+        <w:rPr>
+          <w:rFonts w:ascii="Times New Roman" w:hAnsi="Times New Roman" w:cs="Times New Roman"/>
+          <w:b/>
+          <w:bCs/>
+          <w:u w:val="single"/>
+        </w:rPr>
+        <w:t>model</w:t>
+      </w:r>
+      <w:proofErr w:type="spellEnd"/>
+      <w:r>
+        <w:rPr>
+          <w:rFonts w:ascii="Times New Roman" w:hAnsi="Times New Roman" w:cs="Times New Roman"/>
+          <w:b/>
+          <w:bCs/>
+          <w:u w:val="single"/>
+        </w:rPr>
+        <w:t xml:space="preserve"> basada en patrones</w:t>
       </w:r>
     </w:p>
     <w:p>
@@ -1482,13 +1675,53 @@
         <w:rPr>
           <w:rFonts w:ascii="Times New Roman" w:hAnsi="Times New Roman" w:cs="Times New Roman"/>
         </w:rPr>
-        <w:t xml:space="preserve"> compara la entropía de los bits de decisión antes y después de aplicar el </w:t>
+        <w:t xml:space="preserve"> compara la entropía de los bits de decisión antes y después de aplicar el model</w:t>
+      </w:r>
+      <w:r>
+        <w:rPr>
+          <w:rFonts w:ascii="Times New Roman" w:hAnsi="Times New Roman" w:cs="Times New Roman"/>
+        </w:rPr>
+        <w:t>o</w:t>
+      </w:r>
+      <w:r>
+        <w:rPr>
+          <w:rFonts w:ascii="Times New Roman" w:hAnsi="Times New Roman" w:cs="Times New Roman"/>
+        </w:rPr>
+        <w:t xml:space="preserve"> de contexto </w:t>
       </w:r>
       <w:proofErr w:type="spellStart"/>
       <w:r>
         <w:rPr>
           <w:rFonts w:ascii="Times New Roman" w:hAnsi="Times New Roman" w:cs="Times New Roman"/>
         </w:rPr>
+        <w:t>pattern-based</w:t>
+      </w:r>
+      <w:proofErr w:type="spellEnd"/>
+      <w:r>
+        <w:rPr>
+          <w:rFonts w:ascii="Times New Roman" w:hAnsi="Times New Roman" w:cs="Times New Roman"/>
+        </w:rPr>
+        <w:t xml:space="preserve">. En todos los casos el </w:t>
+      </w:r>
+      <w:proofErr w:type="spellStart"/>
+      <w:r>
+        <w:rPr>
+          <w:rFonts w:ascii="Times New Roman" w:hAnsi="Times New Roman" w:cs="Times New Roman"/>
+        </w:rPr>
+        <w:t>context</w:t>
+      </w:r>
+      <w:proofErr w:type="spellEnd"/>
+      <w:r>
+        <w:rPr>
+          <w:rFonts w:ascii="Times New Roman" w:hAnsi="Times New Roman" w:cs="Times New Roman"/>
+        </w:rPr>
+        <w:t xml:space="preserve"> </w:t>
+      </w:r>
+      <w:proofErr w:type="spellStart"/>
+      <w:r>
+        <w:rPr>
+          <w:rFonts w:ascii="Times New Roman" w:hAnsi="Times New Roman" w:cs="Times New Roman"/>
+        </w:rPr>
         <w:t>model</w:t>
       </w:r>
       <w:proofErr w:type="spellEnd"/>
@@ -1496,80 +1729,53 @@
         <w:rPr>
           <w:rFonts w:ascii="Times New Roman" w:hAnsi="Times New Roman" w:cs="Times New Roman"/>
         </w:rPr>
-        <w:t xml:space="preserve"> de contexto </w:t>
-      </w:r>
-      <w:proofErr w:type="spellStart"/>
-      <w:r>
-        <w:rPr>
-          <w:rFonts w:ascii="Times New Roman" w:hAnsi="Times New Roman" w:cs="Times New Roman"/>
-        </w:rPr>
-        <w:t>pattern-based</w:t>
-      </w:r>
-      <w:proofErr w:type="spellEnd"/>
-      <w:r>
-        <w:rPr>
-          <w:rFonts w:ascii="Times New Roman" w:hAnsi="Times New Roman" w:cs="Times New Roman"/>
-        </w:rPr>
-        <w:t xml:space="preserve"> para los cinco mapas de clasificación. En todos los casos el </w:t>
-      </w:r>
-      <w:proofErr w:type="spellStart"/>
-      <w:r>
-        <w:rPr>
-          <w:rFonts w:ascii="Times New Roman" w:hAnsi="Times New Roman" w:cs="Times New Roman"/>
-        </w:rPr>
-        <w:t>context</w:t>
-      </w:r>
-      <w:proofErr w:type="spellEnd"/>
-      <w:r>
-        <w:rPr>
-          <w:rFonts w:ascii="Times New Roman" w:hAnsi="Times New Roman" w:cs="Times New Roman"/>
-        </w:rPr>
-        <w:t xml:space="preserve"> </w:t>
-      </w:r>
-      <w:proofErr w:type="spellStart"/>
-      <w:r>
-        <w:rPr>
-          <w:rFonts w:ascii="Times New Roman" w:hAnsi="Times New Roman" w:cs="Times New Roman"/>
-        </w:rPr>
-        <w:t>model</w:t>
-      </w:r>
-      <w:proofErr w:type="spellEnd"/>
-      <w:r>
-        <w:rPr>
-          <w:rFonts w:ascii="Times New Roman" w:hAnsi="Times New Roman" w:cs="Times New Roman"/>
-        </w:rPr>
-        <w:t xml:space="preserve"> reduce consistentemente la entropía, confirmando su efectividad para explotar las redundancias espaciales entre píxeles vecinos. </w:t>
+        <w:t xml:space="preserve"> reduce consistentemente la entropía, </w:t>
+      </w:r>
+      <w:r>
+        <w:rPr>
+          <w:rFonts w:ascii="Times New Roman" w:hAnsi="Times New Roman" w:cs="Times New Roman"/>
+        </w:rPr>
+        <w:t>lo que confirma</w:t>
+      </w:r>
+      <w:r>
+        <w:rPr>
+          <w:rFonts w:ascii="Times New Roman" w:hAnsi="Times New Roman" w:cs="Times New Roman"/>
+        </w:rPr>
+        <w:t xml:space="preserve"> su efectividad para explotar las redundancias espaciales entre píxeles vecinos. </w:t>
       </w:r>
     </w:p>
     <w:p>
       <w:pPr>
         <w:rPr>
           <w:rFonts w:ascii="Times New Roman" w:hAnsi="Times New Roman" w:cs="Times New Roman"/>
-        </w:rPr>
-      </w:pPr>
-      <w:r>
-        <w:rPr>
-          <w:rFonts w:ascii="Times New Roman" w:hAnsi="Times New Roman" w:cs="Times New Roman"/>
           <w:b/>
           <w:bCs/>
-        </w:rPr>
-        <w:t xml:space="preserve">Fig </w:t>
-      </w:r>
+          <w:u w:val="single"/>
+        </w:rPr>
+      </w:pPr>
       <w:r>
         <w:rPr>
           <w:rFonts w:ascii="Times New Roman" w:hAnsi="Times New Roman" w:cs="Times New Roman"/>
           <w:b/>
           <w:bCs/>
-        </w:rPr>
-        <w:t>2</w:t>
-      </w:r>
+          <w:u w:val="single"/>
+        </w:rPr>
+        <w:t>Análisis del bit-rate desglosado por bit de decisión y valores crudos</w:t>
+      </w:r>
+    </w:p>
+    <w:p>
+      <w:pPr>
+        <w:rPr>
+          <w:rFonts w:ascii="Times New Roman" w:hAnsi="Times New Roman" w:cs="Times New Roman"/>
+        </w:rPr>
+      </w:pPr>
       <w:r>
         <w:rPr>
           <w:rFonts w:ascii="Times New Roman" w:hAnsi="Times New Roman" w:cs="Times New Roman"/>
           <w:b/>
           <w:bCs/>
         </w:rPr>
-        <w:t>. Desglose del límite teórico y bit-rate de los bits decisión y valores crudos, para dife</w:t>
+        <w:t xml:space="preserve">Fig </w:t>
       </w:r>
       <w:r>
         <w:rPr>
@@ -1577,7 +1783,15 @@
           <w:b/>
           <w:bCs/>
         </w:rPr>
-        <w:t>rentes clases</w:t>
+        <w:t>2</w:t>
+      </w:r>
+      <w:r>
+        <w:rPr>
+          <w:rFonts w:ascii="Times New Roman" w:hAnsi="Times New Roman" w:cs="Times New Roman"/>
+          <w:b/>
+          <w:bCs/>
+        </w:rPr>
+        <w:t>. Desglose del límite teórico y bit-rate de los bits decisión y valores crudos</w:t>
       </w:r>
       <w:r>
         <w:rPr>
@@ -1680,14 +1894,56 @@
         <w:rPr>
           <w:rFonts w:ascii="Times New Roman" w:hAnsi="Times New Roman" w:cs="Times New Roman"/>
         </w:rPr>
-        <w:t xml:space="preserve"> en los cinco mapas de clasificación. Para los bits de </w:t>
+        <w:t xml:space="preserve"> para cada mapa</w:t>
+      </w:r>
+      <w:r>
+        <w:rPr>
+          <w:rFonts w:ascii="Times New Roman" w:hAnsi="Times New Roman" w:cs="Times New Roman"/>
+        </w:rPr>
+        <w:t xml:space="preserve">. Para los bits de decisión, el límite </w:t>
       </w:r>
       <w:r>
         <w:rPr>
           <w:rFonts w:ascii="Times New Roman" w:hAnsi="Times New Roman" w:cs="Times New Roman"/>
         </w:rPr>
         <w:lastRenderedPageBreak/>
-        <w:t xml:space="preserve">decisión, el límite teórico y la tasa de bits real son casi idénticos en todos los mapas, lo que demuestra que el codificador aritmético opera muy cerca del límite de Shannon </w:t>
+        <w:t xml:space="preserve">teórico y la tasa de bits </w:t>
+      </w:r>
+      <w:r>
+        <w:rPr>
+          <w:rFonts w:ascii="Times New Roman" w:hAnsi="Times New Roman" w:cs="Times New Roman"/>
+        </w:rPr>
+        <w:t>final</w:t>
+      </w:r>
+      <w:r>
+        <w:rPr>
+          <w:rFonts w:ascii="Times New Roman" w:hAnsi="Times New Roman" w:cs="Times New Roman"/>
+        </w:rPr>
+        <w:t xml:space="preserve"> son casi idénticos en todos los mapas, </w:t>
+      </w:r>
+      <w:r>
+        <w:rPr>
+          <w:rFonts w:ascii="Times New Roman" w:hAnsi="Times New Roman" w:cs="Times New Roman"/>
+        </w:rPr>
+        <w:t>pues como se mencion</w:t>
+      </w:r>
+      <w:r>
+        <w:rPr>
+          <w:rFonts w:ascii="Times New Roman" w:hAnsi="Times New Roman" w:cs="Times New Roman"/>
+        </w:rPr>
+        <w:t>a</w:t>
+      </w:r>
+      <w:r>
+        <w:rPr>
+          <w:rFonts w:ascii="Times New Roman" w:hAnsi="Times New Roman" w:cs="Times New Roman"/>
+        </w:rPr>
+        <w:t xml:space="preserve"> antes</w:t>
+      </w:r>
+      <w:r>
+        <w:rPr>
+          <w:rFonts w:ascii="Times New Roman" w:hAnsi="Times New Roman" w:cs="Times New Roman"/>
+        </w:rPr>
+        <w:t xml:space="preserve"> el codificador aritmético opera muy cerca del límite de Shannon </w:t>
       </w:r>
       <w:r>
         <w:rPr>
@@ -1699,12 +1955,50 @@
         <w:rPr>
           <w:rFonts w:ascii="Times New Roman" w:hAnsi="Times New Roman" w:cs="Times New Roman"/>
         </w:rPr>
-        <w:t xml:space="preserve">. Sin embargo, para los valores brutos, la tasa de bits real es consistentemente mayor que la entropía teórica, y esta diferencia se amplía con el número de clases. Esta sobrecarga surge porque los valores brutos se transmiten sin codificar utilizando un </w:t>
+        <w:t xml:space="preserve">. Sin embargo, para los valores brutos, la tasa de bits </w:t>
+      </w:r>
+      <w:r>
+        <w:rPr>
+          <w:rFonts w:ascii="Times New Roman" w:hAnsi="Times New Roman" w:cs="Times New Roman"/>
+        </w:rPr>
+        <w:t>final</w:t>
+      </w:r>
+      <w:r>
+        <w:rPr>
+          <w:rFonts w:ascii="Times New Roman" w:hAnsi="Times New Roman" w:cs="Times New Roman"/>
+        </w:rPr>
+        <w:t xml:space="preserve"> es consistentemente mayor que la entropía teórica, y esta diferencia se amplía con el número de clases. Esta sobrecarga</w:t>
+      </w:r>
+      <w:r>
+        <w:rPr>
+          <w:rFonts w:ascii="Times New Roman" w:hAnsi="Times New Roman" w:cs="Times New Roman"/>
+        </w:rPr>
+        <w:t xml:space="preserve"> podría</w:t>
+      </w:r>
+      <w:r>
+        <w:rPr>
+          <w:rFonts w:ascii="Times New Roman" w:hAnsi="Times New Roman" w:cs="Times New Roman"/>
+        </w:rPr>
+        <w:t xml:space="preserve"> </w:t>
+      </w:r>
+      <w:r>
+        <w:rPr>
+          <w:rFonts w:ascii="Times New Roman" w:hAnsi="Times New Roman" w:cs="Times New Roman"/>
+        </w:rPr>
+        <w:t xml:space="preserve">deberse a </w:t>
+      </w:r>
+      <w:r>
+        <w:rPr>
+          <w:rFonts w:ascii="Times New Roman" w:hAnsi="Times New Roman" w:cs="Times New Roman"/>
+        </w:rPr>
+        <w:t xml:space="preserve">que los valores brutos se transmiten sin codificar utilizando un </w:t>
       </w:r>
       <w:proofErr w:type="spellStart"/>
       <w:r>
         <w:rPr>
           <w:rFonts w:ascii="Times New Roman" w:hAnsi="Times New Roman" w:cs="Times New Roman"/>
+          <w:i/>
+          <w:iCs/>
         </w:rPr>
         <w:t>ceil</w:t>
       </w:r>
@@ -1712,6 +2006,8 @@
       <w:r>
         <w:rPr>
           <w:rFonts w:ascii="Times New Roman" w:hAnsi="Times New Roman" w:cs="Times New Roman"/>
+          <w:i/>
+          <w:iCs/>
         </w:rPr>
         <w:t>(log2(</w:t>
       </w:r>
@@ -1719,6 +2015,8 @@
       <w:r>
         <w:rPr>
           <w:rFonts w:ascii="Times New Roman" w:hAnsi="Times New Roman" w:cs="Times New Roman"/>
+          <w:i/>
+          <w:iCs/>
         </w:rPr>
         <w:t>n_classes</w:t>
       </w:r>
@@ -1726,66 +2024,54 @@
       <w:r>
         <w:rPr>
           <w:rFonts w:ascii="Times New Roman" w:hAnsi="Times New Roman" w:cs="Times New Roman"/>
-        </w:rPr>
-        <w:t>)) fijo de bits por valor</w:t>
-      </w:r>
-      <w:r>
-        <w:rPr>
-          <w:rFonts w:ascii="Times New Roman" w:hAnsi="Times New Roman" w:cs="Times New Roman"/>
-        </w:rPr>
-        <w:t xml:space="preserve"> en esta implementación</w:t>
-      </w:r>
-      <w:r>
-        <w:rPr>
-          <w:rFonts w:ascii="Times New Roman" w:hAnsi="Times New Roman" w:cs="Times New Roman"/>
-        </w:rPr>
-        <w:t xml:space="preserve">, en lugar de ser codificados por entropía. Con 32 clases, los valores brutos contribuyen con más de 1,1 </w:t>
+          <w:i/>
+          <w:iCs/>
+        </w:rPr>
+        <w:t>))</w:t>
+      </w:r>
+      <w:r>
+        <w:rPr>
+          <w:rFonts w:ascii="Times New Roman" w:hAnsi="Times New Roman" w:cs="Times New Roman"/>
+        </w:rPr>
+        <w:t xml:space="preserve"> fijo de bits por valor</w:t>
+      </w:r>
+      <w:r>
+        <w:rPr>
+          <w:rFonts w:ascii="Times New Roman" w:hAnsi="Times New Roman" w:cs="Times New Roman"/>
+        </w:rPr>
+        <w:t xml:space="preserve"> </w:t>
+      </w:r>
+      <w:r>
+        <w:rPr>
+          <w:rFonts w:ascii="Times New Roman" w:hAnsi="Times New Roman" w:cs="Times New Roman"/>
+        </w:rPr>
+        <w:t>en esta implementación</w:t>
+      </w:r>
+      <w:r>
+        <w:rPr>
+          <w:rFonts w:ascii="Times New Roman" w:hAnsi="Times New Roman" w:cs="Times New Roman"/>
+        </w:rPr>
+        <w:t xml:space="preserve">, en lugar de ser codificados por entropía. </w:t>
+      </w:r>
+      <w:r>
+        <w:rPr>
+          <w:rFonts w:ascii="Times New Roman" w:hAnsi="Times New Roman" w:cs="Times New Roman"/>
+        </w:rPr>
+        <w:t xml:space="preserve">El análisis detallado de esta ineficiencia y su impacto sobre el </w:t>
       </w:r>
       <w:proofErr w:type="spellStart"/>
       <w:r>
         <w:rPr>
           <w:rFonts w:ascii="Times New Roman" w:hAnsi="Times New Roman" w:cs="Times New Roman"/>
         </w:rPr>
-        <w:t>bpp</w:t>
+        <w:t>bitstream</w:t>
       </w:r>
       <w:proofErr w:type="spellEnd"/>
       <w:r>
         <w:rPr>
           <w:rFonts w:ascii="Times New Roman" w:hAnsi="Times New Roman" w:cs="Times New Roman"/>
         </w:rPr>
-        <w:t xml:space="preserve"> al flujo de bits final, lo que representa casi la mitad de la tasa de bits total, haciendo que el manejo de </w:t>
-      </w:r>
-      <w:r>
-        <w:rPr>
-          <w:rFonts w:ascii="Times New Roman" w:hAnsi="Times New Roman" w:cs="Times New Roman"/>
-        </w:rPr>
-        <w:t>valores crudos</w:t>
-      </w:r>
-      <w:r>
-        <w:rPr>
-          <w:rFonts w:ascii="Times New Roman" w:hAnsi="Times New Roman" w:cs="Times New Roman"/>
-        </w:rPr>
-        <w:t xml:space="preserve"> sea el principal cuello de botella del algoritmo con un alto número de clases.</w:t>
-      </w:r>
-      <w:r>
-        <w:rPr>
-          <w:rFonts w:ascii="Times New Roman" w:hAnsi="Times New Roman" w:cs="Times New Roman"/>
-        </w:rPr>
-        <w:t xml:space="preserve"> En la tabla 2 se muestra </w:t>
-      </w:r>
-      <w:proofErr w:type="spellStart"/>
-      <w:r>
-        <w:rPr>
-          <w:rFonts w:ascii="Times New Roman" w:hAnsi="Times New Roman" w:cs="Times New Roman"/>
-        </w:rPr>
-        <w:t>mas</w:t>
-      </w:r>
-      <w:proofErr w:type="spellEnd"/>
-      <w:r>
-        <w:rPr>
-          <w:rFonts w:ascii="Times New Roman" w:hAnsi="Times New Roman" w:cs="Times New Roman"/>
-        </w:rPr>
-        <w:t xml:space="preserve"> detalle de este último punto. </w:t>
+        <w:t xml:space="preserve"> total se presenta en la Tabla 2.</w:t>
       </w:r>
     </w:p>
     <w:p>
@@ -1794,6 +2080,7 @@
           <w:rFonts w:ascii="Times New Roman" w:hAnsi="Times New Roman" w:cs="Times New Roman"/>
           <w:b/>
           <w:bCs/>
+          <w:u w:val="single"/>
         </w:rPr>
       </w:pPr>
       <w:r>
@@ -1801,1650 +2088,63 @@
           <w:rFonts w:ascii="Times New Roman" w:hAnsi="Times New Roman" w:cs="Times New Roman"/>
           <w:b/>
           <w:bCs/>
-        </w:rPr>
-        <w:t xml:space="preserve">Tabla 2. </w:t>
+          <w:u w:val="single"/>
+        </w:rPr>
+        <w:t xml:space="preserve">Análisis sobre la distribución de pixeles por su longitud de bit de decisión </w:t>
       </w:r>
       <w:r>
         <w:rPr>
           <w:rFonts w:ascii="Times New Roman" w:hAnsi="Times New Roman" w:cs="Times New Roman"/>
           <w:b/>
           <w:bCs/>
-        </w:rPr>
-        <w:t>Eficiencia perdida por transmisión de valores crudos sin codificar</w:t>
-      </w:r>
-    </w:p>
-    <w:tbl>
-      <w:tblPr>
-        <w:tblW w:w="7226" w:type="dxa"/>
-        <w:tblInd w:w="707" w:type="dxa"/>
-        <w:tblCellMar>
-          <w:left w:w="70" w:type="dxa"/>
-          <w:right w:w="70" w:type="dxa"/>
-        </w:tblCellMar>
-        <w:tblLook w:val="04A0" w:firstRow="1" w:lastRow="0" w:firstColumn="1" w:lastColumn="0" w:noHBand="0" w:noVBand="1"/>
-      </w:tblPr>
-      <w:tblGrid>
-        <w:gridCol w:w="1041"/>
-        <w:gridCol w:w="1409"/>
-        <w:gridCol w:w="1062"/>
-        <w:gridCol w:w="1591"/>
-        <w:gridCol w:w="2123"/>
-      </w:tblGrid>
-      <w:tr>
-        <w:trPr>
-          <w:trHeight w:val="296"/>
-        </w:trPr>
-        <w:tc>
-          <w:tcPr>
-            <w:tcW w:w="1041" w:type="dxa"/>
-            <w:tcBorders>
-              <w:top w:val="single" w:sz="4" w:space="0" w:color="auto"/>
-              <w:left w:val="single" w:sz="4" w:space="0" w:color="auto"/>
-              <w:bottom w:val="single" w:sz="4" w:space="0" w:color="auto"/>
-              <w:right w:val="single" w:sz="4" w:space="0" w:color="auto"/>
-            </w:tcBorders>
-            <w:noWrap/>
-            <w:hideMark/>
-          </w:tcPr>
-          <w:p>
-            <w:pPr>
-              <w:spacing w:after="0" w:line="240" w:lineRule="auto"/>
-              <w:jc w:val="center"/>
-              <w:rPr>
-                <w:rFonts w:ascii="Calibri" w:eastAsia="Times New Roman" w:hAnsi="Calibri" w:cs="Calibri"/>
-                <w:b/>
-                <w:bCs/>
-                <w:kern w:val="0"/>
-                <w:sz w:val="22"/>
-                <w:szCs w:val="22"/>
-                <w:lang w:eastAsia="es-ES"/>
-                <w14:ligatures w14:val="none"/>
-              </w:rPr>
-            </w:pPr>
-            <w:proofErr w:type="spellStart"/>
-            <w:r>
-              <w:rPr>
-                <w:rFonts w:ascii="Calibri" w:eastAsia="Times New Roman" w:hAnsi="Calibri" w:cs="Calibri"/>
-                <w:b/>
-                <w:bCs/>
-                <w:kern w:val="0"/>
-                <w:sz w:val="22"/>
-                <w:szCs w:val="22"/>
-                <w:lang w:eastAsia="es-ES"/>
-                <w14:ligatures w14:val="none"/>
-              </w:rPr>
-              <w:t>n_clases</w:t>
-            </w:r>
-            <w:proofErr w:type="spellEnd"/>
-            <w:r>
-              <w:rPr>
-                <w:rFonts w:ascii="Calibri" w:eastAsia="Times New Roman" w:hAnsi="Calibri" w:cs="Calibri"/>
-                <w:b/>
-                <w:bCs/>
-                <w:kern w:val="0"/>
-                <w:sz w:val="22"/>
-                <w:szCs w:val="22"/>
-                <w:lang w:eastAsia="es-ES"/>
-                <w14:ligatures w14:val="none"/>
-              </w:rPr>
-              <w:t xml:space="preserve"> </w:t>
-            </w:r>
-          </w:p>
-        </w:tc>
-        <w:tc>
-          <w:tcPr>
-            <w:tcW w:w="1409" w:type="dxa"/>
-            <w:tcBorders>
-              <w:top w:val="single" w:sz="4" w:space="0" w:color="auto"/>
-              <w:left w:val="nil"/>
-              <w:bottom w:val="single" w:sz="4" w:space="0" w:color="auto"/>
-              <w:right w:val="single" w:sz="4" w:space="0" w:color="auto"/>
-            </w:tcBorders>
-            <w:noWrap/>
-            <w:hideMark/>
-          </w:tcPr>
-          <w:p>
-            <w:pPr>
-              <w:spacing w:after="0" w:line="240" w:lineRule="auto"/>
-              <w:jc w:val="center"/>
-              <w:rPr>
-                <w:rFonts w:ascii="Calibri" w:eastAsia="Times New Roman" w:hAnsi="Calibri" w:cs="Calibri"/>
-                <w:b/>
-                <w:bCs/>
-                <w:kern w:val="0"/>
-                <w:sz w:val="22"/>
-                <w:szCs w:val="22"/>
-                <w:lang w:eastAsia="es-ES"/>
-                <w14:ligatures w14:val="none"/>
-              </w:rPr>
-            </w:pPr>
-            <w:r>
-              <w:rPr>
-                <w:rFonts w:ascii="Calibri" w:eastAsia="Times New Roman" w:hAnsi="Calibri" w:cs="Calibri"/>
-                <w:b/>
-                <w:bCs/>
-                <w:kern w:val="0"/>
-                <w:sz w:val="22"/>
-                <w:szCs w:val="22"/>
-                <w:lang w:eastAsia="es-ES"/>
-                <w14:ligatures w14:val="none"/>
-              </w:rPr>
-              <w:t xml:space="preserve"> </w:t>
-            </w:r>
-            <w:proofErr w:type="spellStart"/>
-            <w:r>
-              <w:rPr>
-                <w:rFonts w:ascii="Calibri" w:eastAsia="Times New Roman" w:hAnsi="Calibri" w:cs="Calibri"/>
-                <w:b/>
-                <w:bCs/>
-                <w:kern w:val="0"/>
-                <w:sz w:val="22"/>
-                <w:szCs w:val="22"/>
-                <w:lang w:eastAsia="es-ES"/>
-                <w14:ligatures w14:val="none"/>
-              </w:rPr>
-              <w:t>H_limit_raw</w:t>
-            </w:r>
-            <w:proofErr w:type="spellEnd"/>
-            <w:r>
-              <w:rPr>
-                <w:rFonts w:ascii="Calibri" w:eastAsia="Times New Roman" w:hAnsi="Calibri" w:cs="Calibri"/>
-                <w:b/>
-                <w:bCs/>
-                <w:kern w:val="0"/>
-                <w:sz w:val="22"/>
-                <w:szCs w:val="22"/>
-                <w:lang w:eastAsia="es-ES"/>
-                <w14:ligatures w14:val="none"/>
-              </w:rPr>
-              <w:t xml:space="preserve"> </w:t>
-            </w:r>
-          </w:p>
-        </w:tc>
-        <w:tc>
-          <w:tcPr>
-            <w:tcW w:w="1062" w:type="dxa"/>
-            <w:tcBorders>
-              <w:top w:val="single" w:sz="4" w:space="0" w:color="auto"/>
-              <w:left w:val="nil"/>
-              <w:bottom w:val="single" w:sz="4" w:space="0" w:color="auto"/>
-              <w:right w:val="single" w:sz="4" w:space="0" w:color="auto"/>
-            </w:tcBorders>
-            <w:noWrap/>
-            <w:hideMark/>
-          </w:tcPr>
-          <w:p>
-            <w:pPr>
-              <w:spacing w:after="0" w:line="240" w:lineRule="auto"/>
-              <w:jc w:val="center"/>
-              <w:rPr>
-                <w:rFonts w:ascii="Calibri" w:eastAsia="Times New Roman" w:hAnsi="Calibri" w:cs="Calibri"/>
-                <w:b/>
-                <w:bCs/>
-                <w:kern w:val="0"/>
-                <w:sz w:val="22"/>
-                <w:szCs w:val="22"/>
-                <w:lang w:eastAsia="es-ES"/>
-                <w14:ligatures w14:val="none"/>
-              </w:rPr>
-            </w:pPr>
-            <w:r>
-              <w:rPr>
-                <w:rFonts w:ascii="Calibri" w:eastAsia="Times New Roman" w:hAnsi="Calibri" w:cs="Calibri"/>
-                <w:b/>
-                <w:bCs/>
-                <w:kern w:val="0"/>
-                <w:sz w:val="22"/>
-                <w:szCs w:val="22"/>
-                <w:lang w:eastAsia="es-ES"/>
-                <w14:ligatures w14:val="none"/>
-              </w:rPr>
-              <w:t xml:space="preserve"> </w:t>
-            </w:r>
-            <w:proofErr w:type="spellStart"/>
-            <w:r>
-              <w:rPr>
-                <w:rFonts w:ascii="Calibri" w:eastAsia="Times New Roman" w:hAnsi="Calibri" w:cs="Calibri"/>
-                <w:b/>
-                <w:bCs/>
-                <w:kern w:val="0"/>
-                <w:sz w:val="22"/>
-                <w:szCs w:val="22"/>
-                <w:lang w:eastAsia="es-ES"/>
-                <w14:ligatures w14:val="none"/>
-              </w:rPr>
-              <w:t>bpp_raw</w:t>
-            </w:r>
-            <w:proofErr w:type="spellEnd"/>
-            <w:r>
-              <w:rPr>
-                <w:rFonts w:ascii="Calibri" w:eastAsia="Times New Roman" w:hAnsi="Calibri" w:cs="Calibri"/>
-                <w:b/>
-                <w:bCs/>
-                <w:kern w:val="0"/>
-                <w:sz w:val="22"/>
-                <w:szCs w:val="22"/>
-                <w:lang w:eastAsia="es-ES"/>
-                <w14:ligatures w14:val="none"/>
-              </w:rPr>
-              <w:t xml:space="preserve"> </w:t>
-            </w:r>
-          </w:p>
-        </w:tc>
-        <w:tc>
-          <w:tcPr>
-            <w:tcW w:w="1591" w:type="dxa"/>
-            <w:tcBorders>
-              <w:top w:val="single" w:sz="4" w:space="0" w:color="auto"/>
-              <w:left w:val="nil"/>
-              <w:bottom w:val="single" w:sz="4" w:space="0" w:color="auto"/>
-              <w:right w:val="single" w:sz="4" w:space="0" w:color="auto"/>
-            </w:tcBorders>
-            <w:noWrap/>
-            <w:hideMark/>
-          </w:tcPr>
-          <w:p>
-            <w:pPr>
-              <w:spacing w:after="0" w:line="240" w:lineRule="auto"/>
-              <w:jc w:val="center"/>
-              <w:rPr>
-                <w:rFonts w:ascii="Calibri" w:eastAsia="Times New Roman" w:hAnsi="Calibri" w:cs="Calibri"/>
-                <w:b/>
-                <w:bCs/>
-                <w:kern w:val="0"/>
-                <w:sz w:val="22"/>
-                <w:szCs w:val="22"/>
-                <w:lang w:eastAsia="es-ES"/>
-                <w14:ligatures w14:val="none"/>
-              </w:rPr>
-            </w:pPr>
-            <w:r>
-              <w:rPr>
-                <w:rFonts w:ascii="Calibri" w:eastAsia="Times New Roman" w:hAnsi="Calibri" w:cs="Calibri"/>
-                <w:b/>
-                <w:bCs/>
-                <w:kern w:val="0"/>
-                <w:sz w:val="22"/>
-                <w:szCs w:val="22"/>
-                <w:lang w:eastAsia="es-ES"/>
-                <w14:ligatures w14:val="none"/>
-              </w:rPr>
-              <w:t xml:space="preserve"> </w:t>
-            </w:r>
-            <w:proofErr w:type="spellStart"/>
-            <w:r>
-              <w:rPr>
-                <w:rFonts w:ascii="Calibri" w:eastAsia="Times New Roman" w:hAnsi="Calibri" w:cs="Calibri"/>
-                <w:b/>
-                <w:bCs/>
-                <w:kern w:val="0"/>
-                <w:sz w:val="22"/>
-                <w:szCs w:val="22"/>
-                <w:lang w:eastAsia="es-ES"/>
-                <w14:ligatures w14:val="none"/>
-              </w:rPr>
-              <w:t>overhead_</w:t>
-            </w:r>
-            <w:r>
-              <w:rPr>
-                <w:rFonts w:ascii="Calibri" w:eastAsia="Times New Roman" w:hAnsi="Calibri" w:cs="Calibri"/>
-                <w:b/>
-                <w:bCs/>
-                <w:kern w:val="0"/>
-                <w:sz w:val="22"/>
-                <w:szCs w:val="22"/>
-                <w:lang w:eastAsia="es-ES"/>
-                <w14:ligatures w14:val="none"/>
-              </w:rPr>
-              <w:t>bpp</w:t>
-            </w:r>
-            <w:proofErr w:type="spellEnd"/>
-            <w:r>
-              <w:rPr>
-                <w:rFonts w:ascii="Calibri" w:eastAsia="Times New Roman" w:hAnsi="Calibri" w:cs="Calibri"/>
-                <w:b/>
-                <w:bCs/>
-                <w:kern w:val="0"/>
-                <w:sz w:val="22"/>
-                <w:szCs w:val="22"/>
-                <w:lang w:eastAsia="es-ES"/>
-                <w14:ligatures w14:val="none"/>
-              </w:rPr>
-              <w:t xml:space="preserve"> </w:t>
-            </w:r>
-          </w:p>
-        </w:tc>
-        <w:tc>
-          <w:tcPr>
-            <w:tcW w:w="2123" w:type="dxa"/>
-            <w:tcBorders>
-              <w:top w:val="single" w:sz="4" w:space="0" w:color="auto"/>
-              <w:left w:val="nil"/>
-              <w:bottom w:val="single" w:sz="4" w:space="0" w:color="auto"/>
-              <w:right w:val="single" w:sz="4" w:space="0" w:color="auto"/>
-            </w:tcBorders>
-            <w:noWrap/>
-            <w:hideMark/>
-          </w:tcPr>
-          <w:p>
-            <w:pPr>
-              <w:spacing w:after="0" w:line="240" w:lineRule="auto"/>
-              <w:jc w:val="center"/>
-              <w:rPr>
-                <w:rFonts w:ascii="Calibri" w:eastAsia="Times New Roman" w:hAnsi="Calibri" w:cs="Calibri"/>
-                <w:b/>
-                <w:bCs/>
-                <w:kern w:val="0"/>
-                <w:sz w:val="22"/>
-                <w:szCs w:val="22"/>
-                <w:lang w:eastAsia="es-ES"/>
-                <w14:ligatures w14:val="none"/>
-              </w:rPr>
-            </w:pPr>
-            <w:r>
-              <w:rPr>
-                <w:rFonts w:ascii="Calibri" w:eastAsia="Times New Roman" w:hAnsi="Calibri" w:cs="Calibri"/>
-                <w:b/>
-                <w:bCs/>
-                <w:kern w:val="0"/>
-                <w:sz w:val="22"/>
-                <w:szCs w:val="22"/>
-                <w:lang w:eastAsia="es-ES"/>
-                <w14:ligatures w14:val="none"/>
-              </w:rPr>
-              <w:t xml:space="preserve"> </w:t>
-            </w:r>
-            <w:proofErr w:type="spellStart"/>
-            <w:r>
-              <w:rPr>
-                <w:rFonts w:ascii="Calibri" w:eastAsia="Times New Roman" w:hAnsi="Calibri" w:cs="Calibri"/>
-                <w:b/>
-                <w:bCs/>
-                <w:kern w:val="0"/>
-                <w:sz w:val="22"/>
-                <w:szCs w:val="22"/>
-                <w:lang w:eastAsia="es-ES"/>
-                <w14:ligatures w14:val="none"/>
-              </w:rPr>
-              <w:t>overhead_relativo</w:t>
-            </w:r>
-            <w:proofErr w:type="spellEnd"/>
-            <w:r>
-              <w:rPr>
-                <w:rFonts w:ascii="Calibri" w:eastAsia="Times New Roman" w:hAnsi="Calibri" w:cs="Calibri"/>
-                <w:b/>
-                <w:bCs/>
-                <w:kern w:val="0"/>
-                <w:sz w:val="22"/>
-                <w:szCs w:val="22"/>
-                <w:lang w:eastAsia="es-ES"/>
-                <w14:ligatures w14:val="none"/>
-              </w:rPr>
-              <w:t xml:space="preserve"> %</w:t>
-            </w:r>
-            <w:r>
-              <w:rPr>
-                <w:rFonts w:ascii="Calibri" w:eastAsia="Times New Roman" w:hAnsi="Calibri" w:cs="Calibri"/>
-                <w:b/>
-                <w:bCs/>
-                <w:kern w:val="0"/>
-                <w:sz w:val="22"/>
-                <w:szCs w:val="22"/>
-                <w:lang w:eastAsia="es-ES"/>
-                <w14:ligatures w14:val="none"/>
-              </w:rPr>
-              <w:t xml:space="preserve"> </w:t>
-            </w:r>
-          </w:p>
-        </w:tc>
-      </w:tr>
-      <w:tr>
-        <w:trPr>
-          <w:trHeight w:val="296"/>
-        </w:trPr>
-        <w:tc>
-          <w:tcPr>
-            <w:tcW w:w="1041" w:type="dxa"/>
-            <w:tcBorders>
-              <w:top w:val="nil"/>
-              <w:left w:val="single" w:sz="4" w:space="0" w:color="auto"/>
-              <w:bottom w:val="single" w:sz="4" w:space="0" w:color="auto"/>
-              <w:right w:val="single" w:sz="4" w:space="0" w:color="auto"/>
-            </w:tcBorders>
-            <w:noWrap/>
-            <w:vAlign w:val="bottom"/>
-            <w:hideMark/>
-          </w:tcPr>
-          <w:p>
-            <w:pPr>
-              <w:spacing w:after="0" w:line="240" w:lineRule="auto"/>
-              <w:jc w:val="center"/>
-              <w:rPr>
-                <w:rFonts w:ascii="Calibri" w:eastAsia="Times New Roman" w:hAnsi="Calibri" w:cs="Calibri"/>
-                <w:color w:val="000000"/>
-                <w:kern w:val="0"/>
-                <w:sz w:val="22"/>
-                <w:szCs w:val="22"/>
-                <w:lang w:eastAsia="es-ES"/>
-                <w14:ligatures w14:val="none"/>
-              </w:rPr>
-            </w:pPr>
-            <w:r>
-              <w:rPr>
-                <w:rFonts w:ascii="Calibri" w:eastAsia="Times New Roman" w:hAnsi="Calibri" w:cs="Calibri"/>
-                <w:color w:val="000000"/>
-                <w:kern w:val="0"/>
-                <w:sz w:val="22"/>
-                <w:szCs w:val="22"/>
-                <w:lang w:eastAsia="es-ES"/>
-                <w14:ligatures w14:val="none"/>
-              </w:rPr>
-              <w:t>4</w:t>
-            </w:r>
-          </w:p>
-        </w:tc>
-        <w:tc>
-          <w:tcPr>
-            <w:tcW w:w="1409" w:type="dxa"/>
-            <w:tcBorders>
-              <w:top w:val="nil"/>
-              <w:left w:val="nil"/>
-              <w:bottom w:val="single" w:sz="4" w:space="0" w:color="auto"/>
-              <w:right w:val="single" w:sz="4" w:space="0" w:color="auto"/>
-            </w:tcBorders>
-            <w:noWrap/>
-            <w:vAlign w:val="bottom"/>
-            <w:hideMark/>
-          </w:tcPr>
-          <w:p>
-            <w:pPr>
-              <w:spacing w:after="0" w:line="240" w:lineRule="auto"/>
-              <w:rPr>
-                <w:rFonts w:ascii="Calibri" w:eastAsia="Times New Roman" w:hAnsi="Calibri" w:cs="Calibri"/>
-                <w:color w:val="000000"/>
-                <w:kern w:val="0"/>
-                <w:sz w:val="22"/>
-                <w:szCs w:val="22"/>
-                <w:lang w:eastAsia="es-ES"/>
-                <w14:ligatures w14:val="none"/>
-              </w:rPr>
-            </w:pPr>
-            <w:r>
-              <w:rPr>
-                <w:rFonts w:ascii="Calibri" w:eastAsia="Times New Roman" w:hAnsi="Calibri" w:cs="Calibri"/>
-                <w:color w:val="000000"/>
-                <w:kern w:val="0"/>
-                <w:sz w:val="22"/>
-                <w:szCs w:val="22"/>
-                <w:lang w:eastAsia="es-ES"/>
-                <w14:ligatures w14:val="none"/>
-              </w:rPr>
-              <w:t xml:space="preserve">            0.0124 </w:t>
-            </w:r>
-          </w:p>
-        </w:tc>
-        <w:tc>
-          <w:tcPr>
-            <w:tcW w:w="1062" w:type="dxa"/>
-            <w:tcBorders>
-              <w:top w:val="nil"/>
-              <w:left w:val="nil"/>
-              <w:bottom w:val="single" w:sz="4" w:space="0" w:color="auto"/>
-              <w:right w:val="single" w:sz="4" w:space="0" w:color="auto"/>
-            </w:tcBorders>
-            <w:noWrap/>
-            <w:vAlign w:val="bottom"/>
-            <w:hideMark/>
-          </w:tcPr>
-          <w:p>
-            <w:pPr>
-              <w:spacing w:after="0" w:line="240" w:lineRule="auto"/>
-              <w:rPr>
-                <w:rFonts w:ascii="Calibri" w:eastAsia="Times New Roman" w:hAnsi="Calibri" w:cs="Calibri"/>
-                <w:color w:val="000000"/>
-                <w:kern w:val="0"/>
-                <w:sz w:val="22"/>
-                <w:szCs w:val="22"/>
-                <w:lang w:eastAsia="es-ES"/>
-                <w14:ligatures w14:val="none"/>
-              </w:rPr>
-            </w:pPr>
-            <w:r>
-              <w:rPr>
-                <w:rFonts w:ascii="Calibri" w:eastAsia="Times New Roman" w:hAnsi="Calibri" w:cs="Calibri"/>
-                <w:color w:val="000000"/>
-                <w:kern w:val="0"/>
-                <w:sz w:val="22"/>
-                <w:szCs w:val="22"/>
-                <w:lang w:eastAsia="es-ES"/>
-                <w14:ligatures w14:val="none"/>
-              </w:rPr>
-              <w:t xml:space="preserve">     0.0165 </w:t>
-            </w:r>
-          </w:p>
-        </w:tc>
-        <w:tc>
-          <w:tcPr>
-            <w:tcW w:w="1591" w:type="dxa"/>
-            <w:tcBorders>
-              <w:top w:val="nil"/>
-              <w:left w:val="nil"/>
-              <w:bottom w:val="single" w:sz="4" w:space="0" w:color="auto"/>
-              <w:right w:val="single" w:sz="4" w:space="0" w:color="auto"/>
-            </w:tcBorders>
-            <w:noWrap/>
-            <w:vAlign w:val="bottom"/>
-            <w:hideMark/>
-          </w:tcPr>
-          <w:p>
-            <w:pPr>
-              <w:spacing w:after="0" w:line="240" w:lineRule="auto"/>
-              <w:rPr>
-                <w:rFonts w:ascii="Calibri" w:eastAsia="Times New Roman" w:hAnsi="Calibri" w:cs="Calibri"/>
-                <w:color w:val="000000"/>
-                <w:kern w:val="0"/>
-                <w:sz w:val="22"/>
-                <w:szCs w:val="22"/>
-                <w:lang w:eastAsia="es-ES"/>
-                <w14:ligatures w14:val="none"/>
-              </w:rPr>
-            </w:pPr>
-            <w:r>
-              <w:rPr>
-                <w:rFonts w:ascii="Calibri" w:eastAsia="Times New Roman" w:hAnsi="Calibri" w:cs="Calibri"/>
-                <w:color w:val="000000"/>
-                <w:kern w:val="0"/>
-                <w:sz w:val="22"/>
-                <w:szCs w:val="22"/>
-                <w:lang w:eastAsia="es-ES"/>
-                <w14:ligatures w14:val="none"/>
-              </w:rPr>
-              <w:t xml:space="preserve">              0.0041 </w:t>
-            </w:r>
-          </w:p>
-        </w:tc>
-        <w:tc>
-          <w:tcPr>
-            <w:tcW w:w="2123" w:type="dxa"/>
-            <w:tcBorders>
-              <w:top w:val="nil"/>
-              <w:left w:val="nil"/>
-              <w:bottom w:val="single" w:sz="4" w:space="0" w:color="auto"/>
-              <w:right w:val="single" w:sz="4" w:space="0" w:color="auto"/>
-            </w:tcBorders>
-            <w:noWrap/>
-            <w:vAlign w:val="bottom"/>
-            <w:hideMark/>
-          </w:tcPr>
-          <w:p>
-            <w:pPr>
-              <w:spacing w:after="0" w:line="240" w:lineRule="auto"/>
-              <w:rPr>
-                <w:rFonts w:ascii="Calibri" w:eastAsia="Times New Roman" w:hAnsi="Calibri" w:cs="Calibri"/>
-                <w:color w:val="000000"/>
-                <w:kern w:val="0"/>
-                <w:sz w:val="22"/>
-                <w:szCs w:val="22"/>
-                <w:lang w:eastAsia="es-ES"/>
-                <w14:ligatures w14:val="none"/>
-              </w:rPr>
-            </w:pPr>
-            <w:r>
-              <w:rPr>
-                <w:rFonts w:ascii="Calibri" w:eastAsia="Times New Roman" w:hAnsi="Calibri" w:cs="Calibri"/>
-                <w:color w:val="000000"/>
-                <w:kern w:val="0"/>
-                <w:sz w:val="22"/>
-                <w:szCs w:val="22"/>
-                <w:lang w:eastAsia="es-ES"/>
-                <w14:ligatures w14:val="none"/>
-              </w:rPr>
-              <w:t xml:space="preserve">                   24.7657 </w:t>
-            </w:r>
-          </w:p>
-        </w:tc>
-      </w:tr>
-      <w:tr>
-        <w:trPr>
-          <w:trHeight w:val="296"/>
-        </w:trPr>
-        <w:tc>
-          <w:tcPr>
-            <w:tcW w:w="1041" w:type="dxa"/>
-            <w:tcBorders>
-              <w:top w:val="nil"/>
-              <w:left w:val="single" w:sz="4" w:space="0" w:color="auto"/>
-              <w:bottom w:val="single" w:sz="4" w:space="0" w:color="auto"/>
-              <w:right w:val="single" w:sz="4" w:space="0" w:color="auto"/>
-            </w:tcBorders>
-            <w:noWrap/>
-            <w:vAlign w:val="bottom"/>
-            <w:hideMark/>
-          </w:tcPr>
-          <w:p>
-            <w:pPr>
-              <w:spacing w:after="0" w:line="240" w:lineRule="auto"/>
-              <w:jc w:val="center"/>
-              <w:rPr>
-                <w:rFonts w:ascii="Calibri" w:eastAsia="Times New Roman" w:hAnsi="Calibri" w:cs="Calibri"/>
-                <w:color w:val="000000"/>
-                <w:kern w:val="0"/>
-                <w:sz w:val="22"/>
-                <w:szCs w:val="22"/>
-                <w:lang w:eastAsia="es-ES"/>
-                <w14:ligatures w14:val="none"/>
-              </w:rPr>
-            </w:pPr>
-            <w:r>
-              <w:rPr>
-                <w:rFonts w:ascii="Calibri" w:eastAsia="Times New Roman" w:hAnsi="Calibri" w:cs="Calibri"/>
-                <w:color w:val="000000"/>
-                <w:kern w:val="0"/>
-                <w:sz w:val="22"/>
-                <w:szCs w:val="22"/>
-                <w:lang w:eastAsia="es-ES"/>
-                <w14:ligatures w14:val="none"/>
-              </w:rPr>
-              <w:t>7</w:t>
-            </w:r>
-          </w:p>
-        </w:tc>
-        <w:tc>
-          <w:tcPr>
-            <w:tcW w:w="1409" w:type="dxa"/>
-            <w:tcBorders>
-              <w:top w:val="nil"/>
-              <w:left w:val="nil"/>
-              <w:bottom w:val="single" w:sz="4" w:space="0" w:color="auto"/>
-              <w:right w:val="single" w:sz="4" w:space="0" w:color="auto"/>
-            </w:tcBorders>
-            <w:noWrap/>
-            <w:vAlign w:val="bottom"/>
-            <w:hideMark/>
-          </w:tcPr>
-          <w:p>
-            <w:pPr>
-              <w:spacing w:after="0" w:line="240" w:lineRule="auto"/>
-              <w:rPr>
-                <w:rFonts w:ascii="Calibri" w:eastAsia="Times New Roman" w:hAnsi="Calibri" w:cs="Calibri"/>
-                <w:color w:val="000000"/>
-                <w:kern w:val="0"/>
-                <w:sz w:val="22"/>
-                <w:szCs w:val="22"/>
-                <w:lang w:eastAsia="es-ES"/>
-                <w14:ligatures w14:val="none"/>
-              </w:rPr>
-            </w:pPr>
-            <w:r>
-              <w:rPr>
-                <w:rFonts w:ascii="Calibri" w:eastAsia="Times New Roman" w:hAnsi="Calibri" w:cs="Calibri"/>
-                <w:color w:val="000000"/>
-                <w:kern w:val="0"/>
-                <w:sz w:val="22"/>
-                <w:szCs w:val="22"/>
-                <w:lang w:eastAsia="es-ES"/>
-                <w14:ligatures w14:val="none"/>
-              </w:rPr>
-              <w:t xml:space="preserve">            0.0296 </w:t>
-            </w:r>
-          </w:p>
-        </w:tc>
-        <w:tc>
-          <w:tcPr>
-            <w:tcW w:w="1062" w:type="dxa"/>
-            <w:tcBorders>
-              <w:top w:val="nil"/>
-              <w:left w:val="nil"/>
-              <w:bottom w:val="single" w:sz="4" w:space="0" w:color="auto"/>
-              <w:right w:val="single" w:sz="4" w:space="0" w:color="auto"/>
-            </w:tcBorders>
-            <w:noWrap/>
-            <w:vAlign w:val="bottom"/>
-            <w:hideMark/>
-          </w:tcPr>
-          <w:p>
-            <w:pPr>
-              <w:spacing w:after="0" w:line="240" w:lineRule="auto"/>
-              <w:rPr>
-                <w:rFonts w:ascii="Calibri" w:eastAsia="Times New Roman" w:hAnsi="Calibri" w:cs="Calibri"/>
-                <w:color w:val="000000"/>
-                <w:kern w:val="0"/>
-                <w:sz w:val="22"/>
-                <w:szCs w:val="22"/>
-                <w:lang w:eastAsia="es-ES"/>
-                <w14:ligatures w14:val="none"/>
-              </w:rPr>
-            </w:pPr>
-            <w:r>
-              <w:rPr>
-                <w:rFonts w:ascii="Calibri" w:eastAsia="Times New Roman" w:hAnsi="Calibri" w:cs="Calibri"/>
-                <w:color w:val="000000"/>
-                <w:kern w:val="0"/>
-                <w:sz w:val="22"/>
-                <w:szCs w:val="22"/>
-                <w:lang w:eastAsia="es-ES"/>
-                <w14:ligatures w14:val="none"/>
-              </w:rPr>
-              <w:t xml:space="preserve">     0.0389 </w:t>
-            </w:r>
-          </w:p>
-        </w:tc>
-        <w:tc>
-          <w:tcPr>
-            <w:tcW w:w="1591" w:type="dxa"/>
-            <w:tcBorders>
-              <w:top w:val="nil"/>
-              <w:left w:val="nil"/>
-              <w:bottom w:val="single" w:sz="4" w:space="0" w:color="auto"/>
-              <w:right w:val="single" w:sz="4" w:space="0" w:color="auto"/>
-            </w:tcBorders>
-            <w:noWrap/>
-            <w:vAlign w:val="bottom"/>
-            <w:hideMark/>
-          </w:tcPr>
-          <w:p>
-            <w:pPr>
-              <w:spacing w:after="0" w:line="240" w:lineRule="auto"/>
-              <w:rPr>
-                <w:rFonts w:ascii="Calibri" w:eastAsia="Times New Roman" w:hAnsi="Calibri" w:cs="Calibri"/>
-                <w:color w:val="000000"/>
-                <w:kern w:val="0"/>
-                <w:sz w:val="22"/>
-                <w:szCs w:val="22"/>
-                <w:lang w:eastAsia="es-ES"/>
-                <w14:ligatures w14:val="none"/>
-              </w:rPr>
-            </w:pPr>
-            <w:r>
-              <w:rPr>
-                <w:rFonts w:ascii="Calibri" w:eastAsia="Times New Roman" w:hAnsi="Calibri" w:cs="Calibri"/>
-                <w:color w:val="000000"/>
-                <w:kern w:val="0"/>
-                <w:sz w:val="22"/>
-                <w:szCs w:val="22"/>
-                <w:lang w:eastAsia="es-ES"/>
-                <w14:ligatures w14:val="none"/>
-              </w:rPr>
-              <w:t xml:space="preserve">              0.0093 </w:t>
-            </w:r>
-          </w:p>
-        </w:tc>
-        <w:tc>
-          <w:tcPr>
-            <w:tcW w:w="2123" w:type="dxa"/>
-            <w:tcBorders>
-              <w:top w:val="nil"/>
-              <w:left w:val="nil"/>
-              <w:bottom w:val="single" w:sz="4" w:space="0" w:color="auto"/>
-              <w:right w:val="single" w:sz="4" w:space="0" w:color="auto"/>
-            </w:tcBorders>
-            <w:noWrap/>
-            <w:vAlign w:val="bottom"/>
-            <w:hideMark/>
-          </w:tcPr>
-          <w:p>
-            <w:pPr>
-              <w:spacing w:after="0" w:line="240" w:lineRule="auto"/>
-              <w:rPr>
-                <w:rFonts w:ascii="Calibri" w:eastAsia="Times New Roman" w:hAnsi="Calibri" w:cs="Calibri"/>
-                <w:color w:val="000000"/>
-                <w:kern w:val="0"/>
-                <w:sz w:val="22"/>
-                <w:szCs w:val="22"/>
-                <w:lang w:eastAsia="es-ES"/>
-                <w14:ligatures w14:val="none"/>
-              </w:rPr>
-            </w:pPr>
-            <w:r>
-              <w:rPr>
-                <w:rFonts w:ascii="Calibri" w:eastAsia="Times New Roman" w:hAnsi="Calibri" w:cs="Calibri"/>
-                <w:color w:val="000000"/>
-                <w:kern w:val="0"/>
-                <w:sz w:val="22"/>
-                <w:szCs w:val="22"/>
-                <w:lang w:eastAsia="es-ES"/>
-                <w14:ligatures w14:val="none"/>
-              </w:rPr>
-              <w:t xml:space="preserve">                   23.8945 </w:t>
-            </w:r>
-          </w:p>
-        </w:tc>
-      </w:tr>
-      <w:tr>
-        <w:trPr>
-          <w:trHeight w:val="296"/>
-        </w:trPr>
-        <w:tc>
-          <w:tcPr>
-            <w:tcW w:w="1041" w:type="dxa"/>
-            <w:tcBorders>
-              <w:top w:val="nil"/>
-              <w:left w:val="single" w:sz="4" w:space="0" w:color="auto"/>
-              <w:bottom w:val="single" w:sz="4" w:space="0" w:color="auto"/>
-              <w:right w:val="single" w:sz="4" w:space="0" w:color="auto"/>
-            </w:tcBorders>
-            <w:noWrap/>
-            <w:vAlign w:val="bottom"/>
-            <w:hideMark/>
-          </w:tcPr>
-          <w:p>
-            <w:pPr>
-              <w:spacing w:after="0" w:line="240" w:lineRule="auto"/>
-              <w:jc w:val="center"/>
-              <w:rPr>
-                <w:rFonts w:ascii="Calibri" w:eastAsia="Times New Roman" w:hAnsi="Calibri" w:cs="Calibri"/>
-                <w:color w:val="000000"/>
-                <w:kern w:val="0"/>
-                <w:sz w:val="22"/>
-                <w:szCs w:val="22"/>
-                <w:lang w:eastAsia="es-ES"/>
-                <w14:ligatures w14:val="none"/>
-              </w:rPr>
-            </w:pPr>
-            <w:r>
-              <w:rPr>
-                <w:rFonts w:ascii="Calibri" w:eastAsia="Times New Roman" w:hAnsi="Calibri" w:cs="Calibri"/>
-                <w:color w:val="000000"/>
-                <w:kern w:val="0"/>
-                <w:sz w:val="22"/>
-                <w:szCs w:val="22"/>
-                <w:lang w:eastAsia="es-ES"/>
-                <w14:ligatures w14:val="none"/>
-              </w:rPr>
-              <w:t>9</w:t>
-            </w:r>
-          </w:p>
-        </w:tc>
-        <w:tc>
-          <w:tcPr>
-            <w:tcW w:w="1409" w:type="dxa"/>
-            <w:tcBorders>
-              <w:top w:val="nil"/>
-              <w:left w:val="nil"/>
-              <w:bottom w:val="single" w:sz="4" w:space="0" w:color="auto"/>
-              <w:right w:val="single" w:sz="4" w:space="0" w:color="auto"/>
-            </w:tcBorders>
-            <w:noWrap/>
-            <w:vAlign w:val="bottom"/>
-            <w:hideMark/>
-          </w:tcPr>
-          <w:p>
-            <w:pPr>
-              <w:spacing w:after="0" w:line="240" w:lineRule="auto"/>
-              <w:rPr>
-                <w:rFonts w:ascii="Calibri" w:eastAsia="Times New Roman" w:hAnsi="Calibri" w:cs="Calibri"/>
-                <w:color w:val="000000"/>
-                <w:kern w:val="0"/>
-                <w:sz w:val="22"/>
-                <w:szCs w:val="22"/>
-                <w:lang w:eastAsia="es-ES"/>
-                <w14:ligatures w14:val="none"/>
-              </w:rPr>
-            </w:pPr>
-            <w:r>
-              <w:rPr>
-                <w:rFonts w:ascii="Calibri" w:eastAsia="Times New Roman" w:hAnsi="Calibri" w:cs="Calibri"/>
-                <w:color w:val="000000"/>
-                <w:kern w:val="0"/>
-                <w:sz w:val="22"/>
-                <w:szCs w:val="22"/>
-                <w:lang w:eastAsia="es-ES"/>
-                <w14:ligatures w14:val="none"/>
-              </w:rPr>
-              <w:t xml:space="preserve">            0.0621 </w:t>
-            </w:r>
-          </w:p>
-        </w:tc>
-        <w:tc>
-          <w:tcPr>
-            <w:tcW w:w="1062" w:type="dxa"/>
-            <w:tcBorders>
-              <w:top w:val="nil"/>
-              <w:left w:val="nil"/>
-              <w:bottom w:val="single" w:sz="4" w:space="0" w:color="auto"/>
-              <w:right w:val="single" w:sz="4" w:space="0" w:color="auto"/>
-            </w:tcBorders>
-            <w:noWrap/>
-            <w:vAlign w:val="bottom"/>
-            <w:hideMark/>
-          </w:tcPr>
-          <w:p>
-            <w:pPr>
-              <w:spacing w:after="0" w:line="240" w:lineRule="auto"/>
-              <w:rPr>
-                <w:rFonts w:ascii="Calibri" w:eastAsia="Times New Roman" w:hAnsi="Calibri" w:cs="Calibri"/>
-                <w:color w:val="000000"/>
-                <w:kern w:val="0"/>
-                <w:sz w:val="22"/>
-                <w:szCs w:val="22"/>
-                <w:lang w:eastAsia="es-ES"/>
-                <w14:ligatures w14:val="none"/>
-              </w:rPr>
-            </w:pPr>
-            <w:r>
-              <w:rPr>
-                <w:rFonts w:ascii="Calibri" w:eastAsia="Times New Roman" w:hAnsi="Calibri" w:cs="Calibri"/>
-                <w:color w:val="000000"/>
-                <w:kern w:val="0"/>
-                <w:sz w:val="22"/>
-                <w:szCs w:val="22"/>
-                <w:lang w:eastAsia="es-ES"/>
-                <w14:ligatures w14:val="none"/>
-              </w:rPr>
-              <w:t xml:space="preserve">     0.1021 </w:t>
-            </w:r>
-          </w:p>
-        </w:tc>
-        <w:tc>
-          <w:tcPr>
-            <w:tcW w:w="1591" w:type="dxa"/>
-            <w:tcBorders>
-              <w:top w:val="nil"/>
-              <w:left w:val="nil"/>
-              <w:bottom w:val="single" w:sz="4" w:space="0" w:color="auto"/>
-              <w:right w:val="single" w:sz="4" w:space="0" w:color="auto"/>
-            </w:tcBorders>
-            <w:noWrap/>
-            <w:vAlign w:val="bottom"/>
-            <w:hideMark/>
-          </w:tcPr>
-          <w:p>
-            <w:pPr>
-              <w:spacing w:after="0" w:line="240" w:lineRule="auto"/>
-              <w:rPr>
-                <w:rFonts w:ascii="Calibri" w:eastAsia="Times New Roman" w:hAnsi="Calibri" w:cs="Calibri"/>
-                <w:color w:val="000000"/>
-                <w:kern w:val="0"/>
-                <w:sz w:val="22"/>
-                <w:szCs w:val="22"/>
-                <w:lang w:eastAsia="es-ES"/>
-                <w14:ligatures w14:val="none"/>
-              </w:rPr>
-            </w:pPr>
-            <w:r>
-              <w:rPr>
-                <w:rFonts w:ascii="Calibri" w:eastAsia="Times New Roman" w:hAnsi="Calibri" w:cs="Calibri"/>
-                <w:color w:val="000000"/>
-                <w:kern w:val="0"/>
-                <w:sz w:val="22"/>
-                <w:szCs w:val="22"/>
-                <w:lang w:eastAsia="es-ES"/>
-                <w14:ligatures w14:val="none"/>
-              </w:rPr>
-              <w:t xml:space="preserve">              0.0400 </w:t>
-            </w:r>
-          </w:p>
-        </w:tc>
-        <w:tc>
-          <w:tcPr>
-            <w:tcW w:w="2123" w:type="dxa"/>
-            <w:tcBorders>
-              <w:top w:val="nil"/>
-              <w:left w:val="nil"/>
-              <w:bottom w:val="single" w:sz="4" w:space="0" w:color="auto"/>
-              <w:right w:val="single" w:sz="4" w:space="0" w:color="auto"/>
-            </w:tcBorders>
-            <w:noWrap/>
-            <w:vAlign w:val="bottom"/>
-            <w:hideMark/>
-          </w:tcPr>
-          <w:p>
-            <w:pPr>
-              <w:spacing w:after="0" w:line="240" w:lineRule="auto"/>
-              <w:rPr>
-                <w:rFonts w:ascii="Calibri" w:eastAsia="Times New Roman" w:hAnsi="Calibri" w:cs="Calibri"/>
-                <w:color w:val="000000"/>
-                <w:kern w:val="0"/>
-                <w:sz w:val="22"/>
-                <w:szCs w:val="22"/>
-                <w:lang w:eastAsia="es-ES"/>
-                <w14:ligatures w14:val="none"/>
-              </w:rPr>
-            </w:pPr>
-            <w:r>
-              <w:rPr>
-                <w:rFonts w:ascii="Calibri" w:eastAsia="Times New Roman" w:hAnsi="Calibri" w:cs="Calibri"/>
-                <w:color w:val="000000"/>
-                <w:kern w:val="0"/>
-                <w:sz w:val="22"/>
-                <w:szCs w:val="22"/>
-                <w:lang w:eastAsia="es-ES"/>
-                <w14:ligatures w14:val="none"/>
-              </w:rPr>
-              <w:t xml:space="preserve">                   39.1435 </w:t>
-            </w:r>
-          </w:p>
-        </w:tc>
-      </w:tr>
-      <w:tr>
-        <w:trPr>
-          <w:trHeight w:val="296"/>
-        </w:trPr>
-        <w:tc>
-          <w:tcPr>
-            <w:tcW w:w="1041" w:type="dxa"/>
-            <w:tcBorders>
-              <w:top w:val="nil"/>
-              <w:left w:val="single" w:sz="4" w:space="0" w:color="auto"/>
-              <w:bottom w:val="single" w:sz="4" w:space="0" w:color="auto"/>
-              <w:right w:val="single" w:sz="4" w:space="0" w:color="auto"/>
-            </w:tcBorders>
-            <w:noWrap/>
-            <w:vAlign w:val="bottom"/>
-            <w:hideMark/>
-          </w:tcPr>
-          <w:p>
-            <w:pPr>
-              <w:spacing w:after="0" w:line="240" w:lineRule="auto"/>
-              <w:jc w:val="center"/>
-              <w:rPr>
-                <w:rFonts w:ascii="Calibri" w:eastAsia="Times New Roman" w:hAnsi="Calibri" w:cs="Calibri"/>
-                <w:color w:val="000000"/>
-                <w:kern w:val="0"/>
-                <w:sz w:val="22"/>
-                <w:szCs w:val="22"/>
-                <w:lang w:eastAsia="es-ES"/>
-                <w14:ligatures w14:val="none"/>
-              </w:rPr>
-            </w:pPr>
-            <w:r>
-              <w:rPr>
-                <w:rFonts w:ascii="Calibri" w:eastAsia="Times New Roman" w:hAnsi="Calibri" w:cs="Calibri"/>
-                <w:color w:val="000000"/>
-                <w:kern w:val="0"/>
-                <w:sz w:val="22"/>
-                <w:szCs w:val="22"/>
-                <w:lang w:eastAsia="es-ES"/>
-                <w14:ligatures w14:val="none"/>
-              </w:rPr>
-              <w:t>17</w:t>
-            </w:r>
-          </w:p>
-        </w:tc>
-        <w:tc>
-          <w:tcPr>
-            <w:tcW w:w="1409" w:type="dxa"/>
-            <w:tcBorders>
-              <w:top w:val="nil"/>
-              <w:left w:val="nil"/>
-              <w:bottom w:val="single" w:sz="4" w:space="0" w:color="auto"/>
-              <w:right w:val="single" w:sz="4" w:space="0" w:color="auto"/>
-            </w:tcBorders>
-            <w:noWrap/>
-            <w:vAlign w:val="bottom"/>
-            <w:hideMark/>
-          </w:tcPr>
-          <w:p>
-            <w:pPr>
-              <w:spacing w:after="0" w:line="240" w:lineRule="auto"/>
-              <w:rPr>
-                <w:rFonts w:ascii="Calibri" w:eastAsia="Times New Roman" w:hAnsi="Calibri" w:cs="Calibri"/>
-                <w:color w:val="000000"/>
-                <w:kern w:val="0"/>
-                <w:sz w:val="22"/>
-                <w:szCs w:val="22"/>
-                <w:lang w:eastAsia="es-ES"/>
-                <w14:ligatures w14:val="none"/>
-              </w:rPr>
-            </w:pPr>
-            <w:r>
-              <w:rPr>
-                <w:rFonts w:ascii="Calibri" w:eastAsia="Times New Roman" w:hAnsi="Calibri" w:cs="Calibri"/>
-                <w:color w:val="000000"/>
-                <w:kern w:val="0"/>
-                <w:sz w:val="22"/>
-                <w:szCs w:val="22"/>
-                <w:lang w:eastAsia="es-ES"/>
-                <w14:ligatures w14:val="none"/>
-              </w:rPr>
-              <w:t xml:space="preserve">            0.1897 </w:t>
-            </w:r>
-          </w:p>
-        </w:tc>
-        <w:tc>
-          <w:tcPr>
-            <w:tcW w:w="1062" w:type="dxa"/>
-            <w:tcBorders>
-              <w:top w:val="nil"/>
-              <w:left w:val="nil"/>
-              <w:bottom w:val="single" w:sz="4" w:space="0" w:color="auto"/>
-              <w:right w:val="single" w:sz="4" w:space="0" w:color="auto"/>
-            </w:tcBorders>
-            <w:noWrap/>
-            <w:vAlign w:val="bottom"/>
-            <w:hideMark/>
-          </w:tcPr>
-          <w:p>
-            <w:pPr>
-              <w:spacing w:after="0" w:line="240" w:lineRule="auto"/>
-              <w:rPr>
-                <w:rFonts w:ascii="Calibri" w:eastAsia="Times New Roman" w:hAnsi="Calibri" w:cs="Calibri"/>
-                <w:color w:val="000000"/>
-                <w:kern w:val="0"/>
-                <w:sz w:val="22"/>
-                <w:szCs w:val="22"/>
-                <w:lang w:eastAsia="es-ES"/>
-                <w14:ligatures w14:val="none"/>
-              </w:rPr>
-            </w:pPr>
-            <w:r>
-              <w:rPr>
-                <w:rFonts w:ascii="Calibri" w:eastAsia="Times New Roman" w:hAnsi="Calibri" w:cs="Calibri"/>
-                <w:color w:val="000000"/>
-                <w:kern w:val="0"/>
-                <w:sz w:val="22"/>
-                <w:szCs w:val="22"/>
-                <w:lang w:eastAsia="es-ES"/>
-                <w14:ligatures w14:val="none"/>
-              </w:rPr>
-              <w:t xml:space="preserve">     0.2809 </w:t>
-            </w:r>
-          </w:p>
-        </w:tc>
-        <w:tc>
-          <w:tcPr>
-            <w:tcW w:w="1591" w:type="dxa"/>
-            <w:tcBorders>
-              <w:top w:val="nil"/>
-              <w:left w:val="nil"/>
-              <w:bottom w:val="single" w:sz="4" w:space="0" w:color="auto"/>
-              <w:right w:val="single" w:sz="4" w:space="0" w:color="auto"/>
-            </w:tcBorders>
-            <w:noWrap/>
-            <w:vAlign w:val="bottom"/>
-            <w:hideMark/>
-          </w:tcPr>
-          <w:p>
-            <w:pPr>
-              <w:spacing w:after="0" w:line="240" w:lineRule="auto"/>
-              <w:rPr>
-                <w:rFonts w:ascii="Calibri" w:eastAsia="Times New Roman" w:hAnsi="Calibri" w:cs="Calibri"/>
-                <w:color w:val="000000"/>
-                <w:kern w:val="0"/>
-                <w:sz w:val="22"/>
-                <w:szCs w:val="22"/>
-                <w:lang w:eastAsia="es-ES"/>
-                <w14:ligatures w14:val="none"/>
-              </w:rPr>
-            </w:pPr>
-            <w:r>
-              <w:rPr>
-                <w:rFonts w:ascii="Calibri" w:eastAsia="Times New Roman" w:hAnsi="Calibri" w:cs="Calibri"/>
-                <w:color w:val="000000"/>
-                <w:kern w:val="0"/>
-                <w:sz w:val="22"/>
-                <w:szCs w:val="22"/>
-                <w:lang w:eastAsia="es-ES"/>
-                <w14:ligatures w14:val="none"/>
-              </w:rPr>
-              <w:t xml:space="preserve">              0.0912 </w:t>
-            </w:r>
-          </w:p>
-        </w:tc>
-        <w:tc>
-          <w:tcPr>
-            <w:tcW w:w="2123" w:type="dxa"/>
-            <w:tcBorders>
-              <w:top w:val="nil"/>
-              <w:left w:val="nil"/>
-              <w:bottom w:val="single" w:sz="4" w:space="0" w:color="auto"/>
-              <w:right w:val="single" w:sz="4" w:space="0" w:color="auto"/>
-            </w:tcBorders>
-            <w:noWrap/>
-            <w:vAlign w:val="bottom"/>
-            <w:hideMark/>
-          </w:tcPr>
-          <w:p>
-            <w:pPr>
-              <w:spacing w:after="0" w:line="240" w:lineRule="auto"/>
-              <w:rPr>
-                <w:rFonts w:ascii="Calibri" w:eastAsia="Times New Roman" w:hAnsi="Calibri" w:cs="Calibri"/>
-                <w:color w:val="000000"/>
-                <w:kern w:val="0"/>
-                <w:sz w:val="22"/>
-                <w:szCs w:val="22"/>
-                <w:lang w:eastAsia="es-ES"/>
-                <w14:ligatures w14:val="none"/>
-              </w:rPr>
-            </w:pPr>
-            <w:r>
-              <w:rPr>
-                <w:rFonts w:ascii="Calibri" w:eastAsia="Times New Roman" w:hAnsi="Calibri" w:cs="Calibri"/>
-                <w:color w:val="000000"/>
-                <w:kern w:val="0"/>
-                <w:sz w:val="22"/>
-                <w:szCs w:val="22"/>
-                <w:lang w:eastAsia="es-ES"/>
-                <w14:ligatures w14:val="none"/>
-              </w:rPr>
-              <w:t xml:space="preserve">                   32.4692 </w:t>
-            </w:r>
-          </w:p>
-        </w:tc>
-      </w:tr>
-      <w:tr>
-        <w:trPr>
-          <w:trHeight w:val="296"/>
-        </w:trPr>
-        <w:tc>
-          <w:tcPr>
-            <w:tcW w:w="1041" w:type="dxa"/>
-            <w:tcBorders>
-              <w:top w:val="nil"/>
-              <w:left w:val="single" w:sz="4" w:space="0" w:color="auto"/>
-              <w:bottom w:val="single" w:sz="4" w:space="0" w:color="auto"/>
-              <w:right w:val="single" w:sz="4" w:space="0" w:color="auto"/>
-            </w:tcBorders>
-            <w:noWrap/>
-            <w:vAlign w:val="bottom"/>
-            <w:hideMark/>
-          </w:tcPr>
-          <w:p>
-            <w:pPr>
-              <w:spacing w:after="0" w:line="240" w:lineRule="auto"/>
-              <w:jc w:val="center"/>
-              <w:rPr>
-                <w:rFonts w:ascii="Calibri" w:eastAsia="Times New Roman" w:hAnsi="Calibri" w:cs="Calibri"/>
-                <w:color w:val="000000"/>
-                <w:kern w:val="0"/>
-                <w:sz w:val="22"/>
-                <w:szCs w:val="22"/>
-                <w:lang w:eastAsia="es-ES"/>
-                <w14:ligatures w14:val="none"/>
-              </w:rPr>
-            </w:pPr>
-            <w:r>
-              <w:rPr>
-                <w:rFonts w:ascii="Calibri" w:eastAsia="Times New Roman" w:hAnsi="Calibri" w:cs="Calibri"/>
-                <w:color w:val="000000"/>
-                <w:kern w:val="0"/>
-                <w:sz w:val="22"/>
-                <w:szCs w:val="22"/>
-                <w:lang w:eastAsia="es-ES"/>
-                <w14:ligatures w14:val="none"/>
-              </w:rPr>
-              <w:t>32</w:t>
-            </w:r>
-          </w:p>
-        </w:tc>
-        <w:tc>
-          <w:tcPr>
-            <w:tcW w:w="1409" w:type="dxa"/>
-            <w:tcBorders>
-              <w:top w:val="nil"/>
-              <w:left w:val="nil"/>
-              <w:bottom w:val="single" w:sz="4" w:space="0" w:color="auto"/>
-              <w:right w:val="single" w:sz="4" w:space="0" w:color="auto"/>
-            </w:tcBorders>
-            <w:noWrap/>
-            <w:vAlign w:val="bottom"/>
-            <w:hideMark/>
-          </w:tcPr>
-          <w:p>
-            <w:pPr>
-              <w:spacing w:after="0" w:line="240" w:lineRule="auto"/>
-              <w:rPr>
-                <w:rFonts w:ascii="Calibri" w:eastAsia="Times New Roman" w:hAnsi="Calibri" w:cs="Calibri"/>
-                <w:color w:val="000000"/>
-                <w:kern w:val="0"/>
-                <w:sz w:val="22"/>
-                <w:szCs w:val="22"/>
-                <w:lang w:eastAsia="es-ES"/>
-                <w14:ligatures w14:val="none"/>
-              </w:rPr>
-            </w:pPr>
-            <w:r>
-              <w:rPr>
-                <w:rFonts w:ascii="Calibri" w:eastAsia="Times New Roman" w:hAnsi="Calibri" w:cs="Calibri"/>
-                <w:color w:val="000000"/>
-                <w:kern w:val="0"/>
-                <w:sz w:val="22"/>
-                <w:szCs w:val="22"/>
-                <w:lang w:eastAsia="es-ES"/>
-                <w14:ligatures w14:val="none"/>
-              </w:rPr>
-              <w:t xml:space="preserve">            1.0209 </w:t>
-            </w:r>
-          </w:p>
-        </w:tc>
-        <w:tc>
-          <w:tcPr>
-            <w:tcW w:w="1062" w:type="dxa"/>
-            <w:tcBorders>
-              <w:top w:val="nil"/>
-              <w:left w:val="nil"/>
-              <w:bottom w:val="single" w:sz="4" w:space="0" w:color="auto"/>
-              <w:right w:val="single" w:sz="4" w:space="0" w:color="auto"/>
-            </w:tcBorders>
-            <w:noWrap/>
-            <w:vAlign w:val="bottom"/>
-            <w:hideMark/>
-          </w:tcPr>
-          <w:p>
-            <w:pPr>
-              <w:spacing w:after="0" w:line="240" w:lineRule="auto"/>
-              <w:rPr>
-                <w:rFonts w:ascii="Calibri" w:eastAsia="Times New Roman" w:hAnsi="Calibri" w:cs="Calibri"/>
-                <w:color w:val="000000"/>
-                <w:kern w:val="0"/>
-                <w:sz w:val="22"/>
-                <w:szCs w:val="22"/>
-                <w:lang w:eastAsia="es-ES"/>
-                <w14:ligatures w14:val="none"/>
-              </w:rPr>
-            </w:pPr>
-            <w:r>
-              <w:rPr>
-                <w:rFonts w:ascii="Calibri" w:eastAsia="Times New Roman" w:hAnsi="Calibri" w:cs="Calibri"/>
-                <w:color w:val="000000"/>
-                <w:kern w:val="0"/>
-                <w:sz w:val="22"/>
-                <w:szCs w:val="22"/>
-                <w:lang w:eastAsia="es-ES"/>
-                <w14:ligatures w14:val="none"/>
-              </w:rPr>
-              <w:t xml:space="preserve">     1.1129 </w:t>
-            </w:r>
-          </w:p>
-        </w:tc>
-        <w:tc>
-          <w:tcPr>
-            <w:tcW w:w="1591" w:type="dxa"/>
-            <w:tcBorders>
-              <w:top w:val="nil"/>
-              <w:left w:val="nil"/>
-              <w:bottom w:val="single" w:sz="4" w:space="0" w:color="auto"/>
-              <w:right w:val="single" w:sz="4" w:space="0" w:color="auto"/>
-            </w:tcBorders>
-            <w:noWrap/>
-            <w:vAlign w:val="bottom"/>
-            <w:hideMark/>
-          </w:tcPr>
-          <w:p>
-            <w:pPr>
-              <w:spacing w:after="0" w:line="240" w:lineRule="auto"/>
-              <w:rPr>
-                <w:rFonts w:ascii="Calibri" w:eastAsia="Times New Roman" w:hAnsi="Calibri" w:cs="Calibri"/>
-                <w:color w:val="000000"/>
-                <w:kern w:val="0"/>
-                <w:sz w:val="22"/>
-                <w:szCs w:val="22"/>
-                <w:lang w:eastAsia="es-ES"/>
-                <w14:ligatures w14:val="none"/>
-              </w:rPr>
-            </w:pPr>
-            <w:r>
-              <w:rPr>
-                <w:rFonts w:ascii="Calibri" w:eastAsia="Times New Roman" w:hAnsi="Calibri" w:cs="Calibri"/>
-                <w:color w:val="000000"/>
-                <w:kern w:val="0"/>
-                <w:sz w:val="22"/>
-                <w:szCs w:val="22"/>
-                <w:lang w:eastAsia="es-ES"/>
-                <w14:ligatures w14:val="none"/>
-              </w:rPr>
-              <w:t xml:space="preserve">              0.0920 </w:t>
-            </w:r>
-          </w:p>
-        </w:tc>
-        <w:tc>
-          <w:tcPr>
-            <w:tcW w:w="2123" w:type="dxa"/>
-            <w:tcBorders>
-              <w:top w:val="nil"/>
-              <w:left w:val="nil"/>
-              <w:bottom w:val="single" w:sz="4" w:space="0" w:color="auto"/>
-              <w:right w:val="single" w:sz="4" w:space="0" w:color="auto"/>
-            </w:tcBorders>
-            <w:noWrap/>
-            <w:vAlign w:val="bottom"/>
-            <w:hideMark/>
-          </w:tcPr>
-          <w:p>
-            <w:pPr>
-              <w:spacing w:after="0" w:line="240" w:lineRule="auto"/>
-              <w:rPr>
-                <w:rFonts w:ascii="Calibri" w:eastAsia="Times New Roman" w:hAnsi="Calibri" w:cs="Calibri"/>
-                <w:color w:val="000000"/>
-                <w:kern w:val="0"/>
-                <w:sz w:val="22"/>
-                <w:szCs w:val="22"/>
-                <w:lang w:eastAsia="es-ES"/>
-                <w14:ligatures w14:val="none"/>
-              </w:rPr>
-            </w:pPr>
-            <w:r>
-              <w:rPr>
-                <w:rFonts w:ascii="Calibri" w:eastAsia="Times New Roman" w:hAnsi="Calibri" w:cs="Calibri"/>
-                <w:color w:val="000000"/>
-                <w:kern w:val="0"/>
-                <w:sz w:val="22"/>
-                <w:szCs w:val="22"/>
-                <w:lang w:eastAsia="es-ES"/>
-                <w14:ligatures w14:val="none"/>
-              </w:rPr>
-              <w:t xml:space="preserve">                      8.2641 </w:t>
-            </w:r>
-          </w:p>
-        </w:tc>
-      </w:tr>
-    </w:tbl>
-    <w:p>
-      <w:pPr>
-        <w:rPr>
-          <w:rFonts w:ascii="Times New Roman" w:hAnsi="Times New Roman" w:cs="Times New Roman"/>
-        </w:rPr>
-      </w:pPr>
+          <w:u w:val="single"/>
+        </w:rPr>
+        <w:t>– análisis del predictor</w:t>
+      </w:r>
     </w:p>
     <w:p>
       <w:pPr>
         <w:rPr>
           <w:rFonts w:ascii="Times New Roman" w:hAnsi="Times New Roman" w:cs="Times New Roman"/>
-        </w:rPr>
-      </w:pPr>
-      <w:r>
-        <w:rPr>
-          <w:rFonts w:ascii="Times New Roman" w:hAnsi="Times New Roman" w:cs="Times New Roman"/>
-        </w:rPr>
-        <w:t xml:space="preserve">La Tabla 2 muestra la eficiencia perdida por transmitir los valores crudos sin codificar. La columna </w:t>
-      </w:r>
-      <w:proofErr w:type="spellStart"/>
-      <w:r>
-        <w:rPr>
-          <w:rFonts w:ascii="Times New Roman" w:hAnsi="Times New Roman" w:cs="Times New Roman"/>
-        </w:rPr>
-        <w:t>overhead_bpp</w:t>
-      </w:r>
-      <w:proofErr w:type="spellEnd"/>
-      <w:r>
-        <w:rPr>
-          <w:rFonts w:ascii="Times New Roman" w:hAnsi="Times New Roman" w:cs="Times New Roman"/>
-        </w:rPr>
-        <w:t xml:space="preserve"> indica cuántos bits por </w:t>
-      </w:r>
-      <w:r>
-        <w:rPr>
-          <w:rFonts w:ascii="Times New Roman" w:hAnsi="Times New Roman" w:cs="Times New Roman"/>
-        </w:rPr>
-        <w:t>píxel</w:t>
-      </w:r>
-      <w:r>
-        <w:rPr>
-          <w:rFonts w:ascii="Times New Roman" w:hAnsi="Times New Roman" w:cs="Times New Roman"/>
-        </w:rPr>
-        <w:t xml:space="preserve"> adicionales se gastan respecto al límite teórico </w:t>
-      </w:r>
-      <w:proofErr w:type="spellStart"/>
-      <w:r>
-        <w:rPr>
-          <w:rFonts w:ascii="Times New Roman" w:hAnsi="Times New Roman" w:cs="Times New Roman"/>
-        </w:rPr>
-        <w:t>H_</w:t>
-      </w:r>
-      <w:r>
-        <w:rPr>
-          <w:rFonts w:ascii="Times New Roman" w:hAnsi="Times New Roman" w:cs="Times New Roman"/>
-        </w:rPr>
-        <w:t>limit_</w:t>
-      </w:r>
-      <w:r>
-        <w:rPr>
-          <w:rFonts w:ascii="Times New Roman" w:hAnsi="Times New Roman" w:cs="Times New Roman"/>
-        </w:rPr>
-        <w:t>raw</w:t>
-      </w:r>
-      <w:proofErr w:type="spellEnd"/>
-      <w:r>
-        <w:rPr>
-          <w:rFonts w:ascii="Times New Roman" w:hAnsi="Times New Roman" w:cs="Times New Roman"/>
-        </w:rPr>
-        <w:t xml:space="preserve">, mientras que </w:t>
-      </w:r>
-      <w:proofErr w:type="spellStart"/>
-      <w:r>
-        <w:rPr>
-          <w:rFonts w:ascii="Times New Roman" w:hAnsi="Times New Roman" w:cs="Times New Roman"/>
-        </w:rPr>
-        <w:t>overhead</w:t>
-      </w:r>
-      <w:proofErr w:type="spellEnd"/>
-      <w:r>
-        <w:rPr>
-          <w:rFonts w:ascii="Times New Roman" w:hAnsi="Times New Roman" w:cs="Times New Roman"/>
-        </w:rPr>
-        <w:t xml:space="preserve">_% expresa esta pérdida en términos relativos. Se observa que el </w:t>
-      </w:r>
-      <w:proofErr w:type="spellStart"/>
-      <w:r>
-        <w:rPr>
-          <w:rFonts w:ascii="Times New Roman" w:hAnsi="Times New Roman" w:cs="Times New Roman"/>
-        </w:rPr>
-        <w:t>overhead</w:t>
-      </w:r>
-      <w:proofErr w:type="spellEnd"/>
-      <w:r>
-        <w:rPr>
-          <w:rFonts w:ascii="Times New Roman" w:hAnsi="Times New Roman" w:cs="Times New Roman"/>
-        </w:rPr>
-        <w:t xml:space="preserve"> relativo es más significativo para 9 y 17 clases, donde el número de </w:t>
-      </w:r>
-      <w:r>
-        <w:rPr>
-          <w:rFonts w:ascii="Times New Roman" w:hAnsi="Times New Roman" w:cs="Times New Roman"/>
-        </w:rPr>
-        <w:t>valores crudos</w:t>
-      </w:r>
-      <w:r>
-        <w:rPr>
-          <w:rFonts w:ascii="Times New Roman" w:hAnsi="Times New Roman" w:cs="Times New Roman"/>
-        </w:rPr>
-        <w:t xml:space="preserve"> es relevante pero el alfabeto aún no es tan grande. Para 32 clases el </w:t>
-      </w:r>
-      <w:proofErr w:type="spellStart"/>
-      <w:r>
-        <w:rPr>
-          <w:rFonts w:ascii="Times New Roman" w:hAnsi="Times New Roman" w:cs="Times New Roman"/>
-        </w:rPr>
-        <w:t>overhead</w:t>
-      </w:r>
-      <w:proofErr w:type="spellEnd"/>
-      <w:r>
-        <w:rPr>
-          <w:rFonts w:ascii="Times New Roman" w:hAnsi="Times New Roman" w:cs="Times New Roman"/>
-        </w:rPr>
-        <w:t xml:space="preserve"> relativo disminuye porque el límite teórico </w:t>
-      </w:r>
-      <w:proofErr w:type="spellStart"/>
-      <w:r>
-        <w:rPr>
-          <w:rFonts w:ascii="Times New Roman" w:hAnsi="Times New Roman" w:cs="Times New Roman"/>
-        </w:rPr>
-        <w:t>H_</w:t>
-      </w:r>
-      <w:r>
-        <w:rPr>
-          <w:rFonts w:ascii="Times New Roman" w:hAnsi="Times New Roman" w:cs="Times New Roman"/>
-        </w:rPr>
-        <w:t>limit_</w:t>
-      </w:r>
-      <w:r>
-        <w:rPr>
-          <w:rFonts w:ascii="Times New Roman" w:hAnsi="Times New Roman" w:cs="Times New Roman"/>
-        </w:rPr>
-        <w:t>raw</w:t>
-      </w:r>
-      <w:proofErr w:type="spellEnd"/>
-      <w:r>
-        <w:rPr>
-          <w:rFonts w:ascii="Times New Roman" w:hAnsi="Times New Roman" w:cs="Times New Roman"/>
-        </w:rPr>
-        <w:t xml:space="preserve"> ya es alto de por sí dado el gran número de clases posibles, pero el </w:t>
-      </w:r>
-      <w:proofErr w:type="spellStart"/>
-      <w:r>
-        <w:rPr>
-          <w:rFonts w:ascii="Times New Roman" w:hAnsi="Times New Roman" w:cs="Times New Roman"/>
-        </w:rPr>
-        <w:t>overhead</w:t>
-      </w:r>
-      <w:proofErr w:type="spellEnd"/>
-      <w:r>
-        <w:rPr>
-          <w:rFonts w:ascii="Times New Roman" w:hAnsi="Times New Roman" w:cs="Times New Roman"/>
-        </w:rPr>
-        <w:t xml:space="preserve"> absoluto sigue siendo el mayor de todos los mapas.</w:t>
-      </w:r>
-      <w:r>
-        <w:rPr>
-          <w:rFonts w:ascii="Times New Roman" w:hAnsi="Times New Roman" w:cs="Times New Roman"/>
-        </w:rPr>
-        <w:t xml:space="preserve"> </w:t>
+          <w:b/>
+          <w:bCs/>
+        </w:rPr>
+      </w:pPr>
+      <w:r>
+        <w:rPr>
+          <w:rFonts w:ascii="Times New Roman" w:hAnsi="Times New Roman" w:cs="Times New Roman"/>
+          <w:b/>
+          <w:bCs/>
+        </w:rPr>
+        <w:t xml:space="preserve">Fig </w:t>
+      </w:r>
+      <w:r>
+        <w:rPr>
+          <w:rFonts w:ascii="Times New Roman" w:hAnsi="Times New Roman" w:cs="Times New Roman"/>
+          <w:b/>
+          <w:bCs/>
+        </w:rPr>
+        <w:t>3</w:t>
+      </w:r>
+      <w:r>
+        <w:rPr>
+          <w:rFonts w:ascii="Times New Roman" w:hAnsi="Times New Roman" w:cs="Times New Roman"/>
+          <w:b/>
+          <w:bCs/>
+        </w:rPr>
+        <w:t xml:space="preserve">. Distribución estadística de pixeles por longitud de bits de decisión </w:t>
       </w:r>
     </w:p>
     <w:p>
       <w:pPr>
         <w:rPr>
           <w:rFonts w:ascii="Times New Roman" w:hAnsi="Times New Roman" w:cs="Times New Roman"/>
-          <w:b/>
-          <w:bCs/>
-        </w:rPr>
-      </w:pPr>
-      <w:r>
-        <w:rPr>
-          <w:rFonts w:ascii="Times New Roman" w:hAnsi="Times New Roman" w:cs="Times New Roman"/>
-          <w:b/>
-          <w:bCs/>
-        </w:rPr>
-        <w:t xml:space="preserve">Fig </w:t>
-      </w:r>
-      <w:r>
-        <w:rPr>
-          <w:rFonts w:ascii="Times New Roman" w:hAnsi="Times New Roman" w:cs="Times New Roman"/>
-          <w:b/>
-          <w:bCs/>
-        </w:rPr>
-        <w:t>3</w:t>
-      </w:r>
-      <w:r>
-        <w:rPr>
-          <w:rFonts w:ascii="Times New Roman" w:hAnsi="Times New Roman" w:cs="Times New Roman"/>
-          <w:b/>
-          <w:bCs/>
-        </w:rPr>
-        <w:t xml:space="preserve">. Distribución estadística de pixeles por longitud de bits de decisión </w:t>
-      </w:r>
-    </w:p>
-    <w:p>
-      <w:pPr>
-        <w:rPr>
-          <w:rFonts w:ascii="Times New Roman" w:hAnsi="Times New Roman" w:cs="Times New Roman"/>
         </w:rPr>
       </w:pPr>
       <w:r>
         <w:rPr>
           <w:noProof/>
         </w:rPr>
-        <w:lastRenderedPageBreak/>
         <w:drawing>
           <wp:inline distT="0" distB="0" distL="0" distR="0" wp14:anchorId="125EEC19" wp14:editId="2A615A7C">
             <wp:extent cx="5400040" cy="3489325"/>
@@ -3536,19 +2236,19 @@
         <w:rPr>
           <w:rFonts w:ascii="Times New Roman" w:hAnsi="Times New Roman" w:cs="Times New Roman"/>
         </w:rPr>
-        <w:t xml:space="preserve">decisión en los cinco mapas de clasificación. Para mapas con pocas clases, el predictor es altamente efectivo: en el mapa de 4 clases, el 94 % de los píxeles se resuelven con una sola decisión binaria, lo que significa que el píxel actual coincide con su vecino izquierdo en la gran mayoría de los casos. A medida que aumenta el número de clases, esta eficiencia se degrada notablemente. En el mapa de 32 clases, solo el 52 % de los píxeles se resuelven con una decisión, y el segmento no </w:t>
-      </w:r>
-      <w:r>
-        <w:rPr>
-          <w:rFonts w:ascii="Times New Roman" w:hAnsi="Times New Roman" w:cs="Times New Roman"/>
-        </w:rPr>
-        <w:t>codificado</w:t>
-      </w:r>
-      <w:r>
-        <w:rPr>
-          <w:rFonts w:ascii="Times New Roman" w:hAnsi="Times New Roman" w:cs="Times New Roman"/>
-        </w:rPr>
-        <w:t xml:space="preserve"> (píxeles que no coinciden con ninguno de sus cuatro vecinos y deben transmitirse como valores sin procesar) crece hasta el 22 % de todos los píxeles. Los casos que requieren 3 o 4 decisiones siguen siendo marginales en todos los mapas, lo que</w:t>
+        <w:t xml:space="preserve">decisión. Para mapas con pocas clases, el predictor es altamente efectivo: en el mapa de 4 clases, el 94 % de los píxeles se resuelven con una sola decisión binaria, lo que significa que el píxel actual coincide con su vecino izquierdo en la gran mayoría de los casos. A medida que aumenta el número de clases, esta eficiencia se degrada notablemente. En el mapa de 32 clases, solo el 52 % de los píxeles se resuelven con una decisión, y el segmento </w:t>
+      </w:r>
+      <w:r>
+        <w:rPr>
+          <w:rFonts w:ascii="Times New Roman" w:hAnsi="Times New Roman" w:cs="Times New Roman"/>
+        </w:rPr>
+        <w:t xml:space="preserve">de valores crudos </w:t>
+      </w:r>
+      <w:r>
+        <w:rPr>
+          <w:rFonts w:ascii="Times New Roman" w:hAnsi="Times New Roman" w:cs="Times New Roman"/>
+        </w:rPr>
+        <w:t>(píxeles que no coinciden con ninguno de sus cuatro vecinos y deben transmitirse como valores sin procesar) crece hasta el 22 % de todos los píxeles. Los casos que requieren 3 o 4 decisiones siguen siendo marginales en todos los mapas, lo que</w:t>
       </w:r>
       <w:r>
         <w:rPr>
@@ -3617,6 +2317,7 @@
           <w:rFonts w:ascii="Times New Roman" w:hAnsi="Times New Roman" w:cs="Times New Roman"/>
           <w:b/>
           <w:bCs/>
+          <w:u w:val="single"/>
         </w:rPr>
       </w:pPr>
       <w:r>
@@ -3624,24 +2325,59 @@
           <w:rFonts w:ascii="Times New Roman" w:hAnsi="Times New Roman" w:cs="Times New Roman"/>
           <w:b/>
           <w:bCs/>
-        </w:rPr>
-        <w:t xml:space="preserve">Fig </w:t>
-      </w:r>
-      <w:r>
+          <w:u w:val="single"/>
+        </w:rPr>
+        <w:lastRenderedPageBreak/>
+        <w:t xml:space="preserve">Análisis de los contextos </w:t>
+      </w:r>
+    </w:p>
+    <w:p>
+      <w:pPr>
         <w:rPr>
           <w:rFonts w:ascii="Times New Roman" w:hAnsi="Times New Roman" w:cs="Times New Roman"/>
           <w:b/>
           <w:bCs/>
         </w:rPr>
-        <w:t>4</w:t>
-      </w:r>
+      </w:pPr>
       <w:r>
         <w:rPr>
           <w:rFonts w:ascii="Times New Roman" w:hAnsi="Times New Roman" w:cs="Times New Roman"/>
           <w:b/>
           <w:bCs/>
         </w:rPr>
-        <w:t xml:space="preserve">. Activación de contexto por n clases </w:t>
+        <w:t xml:space="preserve">Fig </w:t>
+      </w:r>
+      <w:r>
+        <w:rPr>
+          <w:rFonts w:ascii="Times New Roman" w:hAnsi="Times New Roman" w:cs="Times New Roman"/>
+          <w:b/>
+          <w:bCs/>
+        </w:rPr>
+        <w:t>4</w:t>
+      </w:r>
+      <w:r>
+        <w:rPr>
+          <w:rFonts w:ascii="Times New Roman" w:hAnsi="Times New Roman" w:cs="Times New Roman"/>
+          <w:b/>
+          <w:bCs/>
+        </w:rPr>
+        <w:t xml:space="preserve">. Activación de contexto por </w:t>
+      </w:r>
+      <w:r>
+        <w:rPr>
+          <w:rFonts w:ascii="Times New Roman" w:hAnsi="Times New Roman" w:cs="Times New Roman"/>
+          <w:b/>
+          <w:bCs/>
+        </w:rPr>
+        <w:t>número de</w:t>
+      </w:r>
+      <w:r>
+        <w:rPr>
+          <w:rFonts w:ascii="Times New Roman" w:hAnsi="Times New Roman" w:cs="Times New Roman"/>
+          <w:b/>
+          <w:bCs/>
+        </w:rPr>
+        <w:t xml:space="preserve"> clases </w:t>
       </w:r>
     </w:p>
     <w:p>
@@ -3654,7 +2390,6 @@
         <w:rPr>
           <w:noProof/>
         </w:rPr>
-        <w:lastRenderedPageBreak/>
         <w:drawing>
           <wp:inline distT="0" distB="0" distL="0" distR="0" wp14:anchorId="7F87FE69" wp14:editId="0196FA81">
             <wp:extent cx="5400040" cy="2160270"/>
@@ -3709,7 +2444,6 @@
       <w:pPr>
         <w:rPr>
           <w:rFonts w:ascii="Times New Roman" w:hAnsi="Times New Roman" w:cs="Times New Roman"/>
-          <w:u w:val="single"/>
         </w:rPr>
       </w:pPr>
       <w:r>
@@ -3752,7 +2486,1716 @@
         <w:rPr>
           <w:rFonts w:ascii="Times New Roman" w:hAnsi="Times New Roman" w:cs="Times New Roman"/>
         </w:rPr>
-        <w:t xml:space="preserve"> con más clases, el modelo de contexto debe manejar una mayor variedad de configuraciones de vecindario, lo que reduce el predominio de patrones homogéneos simples y contribuye a la degradación en la eficiencia de compresión observada con un mayor número de clases.</w:t>
+        <w:t xml:space="preserve"> con más clases, el modelo de contexto debe manejar una mayor variedad de configuraciones de vecindario, lo que reduce el predominio de patrones homogéneos simples</w:t>
+      </w:r>
+      <w:r>
+        <w:rPr>
+          <w:rFonts w:ascii="Times New Roman" w:hAnsi="Times New Roman" w:cs="Times New Roman"/>
+        </w:rPr>
+        <w:t>.</w:t>
+      </w:r>
+    </w:p>
+    <w:p>
+      <w:pPr>
+        <w:rPr>
+          <w:rFonts w:ascii="Times New Roman" w:hAnsi="Times New Roman" w:cs="Times New Roman"/>
+          <w:b/>
+          <w:bCs/>
+        </w:rPr>
+      </w:pPr>
+      <w:r>
+        <w:rPr>
+          <w:rFonts w:ascii="Times New Roman" w:hAnsi="Times New Roman" w:cs="Times New Roman"/>
+          <w:b/>
+          <w:bCs/>
+        </w:rPr>
+        <w:t xml:space="preserve">Tabla 2. Análisis de eficiencia perdida por transmisión </w:t>
+      </w:r>
+      <w:proofErr w:type="spellStart"/>
+      <w:r>
+        <w:rPr>
+          <w:rFonts w:ascii="Times New Roman" w:hAnsi="Times New Roman" w:cs="Times New Roman"/>
+          <w:b/>
+          <w:bCs/>
+        </w:rPr>
+        <w:t>uncoded</w:t>
+      </w:r>
+      <w:proofErr w:type="spellEnd"/>
+      <w:r>
+        <w:rPr>
+          <w:rFonts w:ascii="Times New Roman" w:hAnsi="Times New Roman" w:cs="Times New Roman"/>
+          <w:b/>
+          <w:bCs/>
+        </w:rPr>
+        <w:t xml:space="preserve"> de valores crudos</w:t>
+      </w:r>
+    </w:p>
+    <w:tbl>
+      <w:tblPr>
+        <w:tblW w:w="7542" w:type="dxa"/>
+        <w:tblInd w:w="473" w:type="dxa"/>
+        <w:tblCellMar>
+          <w:left w:w="70" w:type="dxa"/>
+          <w:right w:w="70" w:type="dxa"/>
+        </w:tblCellMar>
+        <w:tblLook w:val="04A0" w:firstRow="1" w:lastRow="0" w:firstColumn="1" w:lastColumn="0" w:noHBand="0" w:noVBand="1"/>
+      </w:tblPr>
+      <w:tblGrid>
+        <w:gridCol w:w="1057"/>
+        <w:gridCol w:w="1432"/>
+        <w:gridCol w:w="1432"/>
+        <w:gridCol w:w="1960"/>
+        <w:gridCol w:w="1661"/>
+      </w:tblGrid>
+      <w:tr>
+        <w:trPr>
+          <w:trHeight w:val="286"/>
+        </w:trPr>
+        <w:tc>
+          <w:tcPr>
+            <w:tcW w:w="1057" w:type="dxa"/>
+            <w:tcBorders>
+              <w:top w:val="single" w:sz="4" w:space="0" w:color="auto"/>
+              <w:left w:val="single" w:sz="4" w:space="0" w:color="auto"/>
+              <w:bottom w:val="single" w:sz="4" w:space="0" w:color="auto"/>
+              <w:right w:val="single" w:sz="4" w:space="0" w:color="auto"/>
+            </w:tcBorders>
+            <w:noWrap/>
+            <w:hideMark/>
+          </w:tcPr>
+          <w:p>
+            <w:pPr>
+              <w:spacing w:after="0" w:line="240" w:lineRule="auto"/>
+              <w:jc w:val="center"/>
+              <w:rPr>
+                <w:rFonts w:ascii="Calibri" w:eastAsia="Times New Roman" w:hAnsi="Calibri" w:cs="Calibri"/>
+                <w:b/>
+                <w:bCs/>
+                <w:kern w:val="0"/>
+                <w:sz w:val="22"/>
+                <w:szCs w:val="22"/>
+                <w:lang w:eastAsia="es-ES"/>
+                <w14:ligatures w14:val="none"/>
+              </w:rPr>
+            </w:pPr>
+            <w:proofErr w:type="spellStart"/>
+            <w:r>
+              <w:rPr>
+                <w:rFonts w:ascii="Calibri" w:eastAsia="Times New Roman" w:hAnsi="Calibri" w:cs="Calibri"/>
+                <w:b/>
+                <w:bCs/>
+                <w:kern w:val="0"/>
+                <w:sz w:val="22"/>
+                <w:szCs w:val="22"/>
+                <w:lang w:eastAsia="es-ES"/>
+                <w14:ligatures w14:val="none"/>
+              </w:rPr>
+              <w:t>n_clases</w:t>
+            </w:r>
+            <w:proofErr w:type="spellEnd"/>
+          </w:p>
+        </w:tc>
+        <w:tc>
+          <w:tcPr>
+            <w:tcW w:w="1432" w:type="dxa"/>
+            <w:tcBorders>
+              <w:top w:val="single" w:sz="4" w:space="0" w:color="auto"/>
+              <w:left w:val="nil"/>
+              <w:bottom w:val="single" w:sz="4" w:space="0" w:color="auto"/>
+              <w:right w:val="single" w:sz="4" w:space="0" w:color="auto"/>
+            </w:tcBorders>
+            <w:noWrap/>
+            <w:hideMark/>
+          </w:tcPr>
+          <w:p>
+            <w:pPr>
+              <w:spacing w:after="0" w:line="240" w:lineRule="auto"/>
+              <w:jc w:val="center"/>
+              <w:rPr>
+                <w:rFonts w:ascii="Calibri" w:eastAsia="Times New Roman" w:hAnsi="Calibri" w:cs="Calibri"/>
+                <w:b/>
+                <w:bCs/>
+                <w:kern w:val="0"/>
+                <w:sz w:val="22"/>
+                <w:szCs w:val="22"/>
+                <w:lang w:eastAsia="es-ES"/>
+                <w14:ligatures w14:val="none"/>
+              </w:rPr>
+            </w:pPr>
+            <w:r>
+              <w:rPr>
+                <w:rFonts w:ascii="Calibri" w:eastAsia="Times New Roman" w:hAnsi="Calibri" w:cs="Calibri"/>
+                <w:b/>
+                <w:bCs/>
+                <w:kern w:val="0"/>
+                <w:sz w:val="22"/>
+                <w:szCs w:val="22"/>
+                <w:lang w:eastAsia="es-ES"/>
+                <w14:ligatures w14:val="none"/>
+              </w:rPr>
+              <w:t>%</w:t>
+            </w:r>
+            <w:proofErr w:type="spellStart"/>
+            <w:r>
+              <w:rPr>
+                <w:rFonts w:ascii="Calibri" w:eastAsia="Times New Roman" w:hAnsi="Calibri" w:cs="Calibri"/>
+                <w:b/>
+                <w:bCs/>
+                <w:kern w:val="0"/>
+                <w:sz w:val="22"/>
+                <w:szCs w:val="22"/>
+                <w:lang w:eastAsia="es-ES"/>
+                <w14:ligatures w14:val="none"/>
+              </w:rPr>
+              <w:t>bpp_bit</w:t>
+            </w:r>
+            <w:proofErr w:type="spellEnd"/>
+          </w:p>
+        </w:tc>
+        <w:tc>
+          <w:tcPr>
+            <w:tcW w:w="1432" w:type="dxa"/>
+            <w:tcBorders>
+              <w:top w:val="single" w:sz="4" w:space="0" w:color="auto"/>
+              <w:left w:val="nil"/>
+              <w:bottom w:val="single" w:sz="4" w:space="0" w:color="auto"/>
+              <w:right w:val="single" w:sz="4" w:space="0" w:color="auto"/>
+            </w:tcBorders>
+            <w:noWrap/>
+            <w:hideMark/>
+          </w:tcPr>
+          <w:p>
+            <w:pPr>
+              <w:spacing w:after="0" w:line="240" w:lineRule="auto"/>
+              <w:jc w:val="center"/>
+              <w:rPr>
+                <w:rFonts w:ascii="Calibri" w:eastAsia="Times New Roman" w:hAnsi="Calibri" w:cs="Calibri"/>
+                <w:b/>
+                <w:bCs/>
+                <w:kern w:val="0"/>
+                <w:sz w:val="22"/>
+                <w:szCs w:val="22"/>
+                <w:lang w:eastAsia="es-ES"/>
+                <w14:ligatures w14:val="none"/>
+              </w:rPr>
+            </w:pPr>
+            <w:r>
+              <w:rPr>
+                <w:rFonts w:ascii="Calibri" w:eastAsia="Times New Roman" w:hAnsi="Calibri" w:cs="Calibri"/>
+                <w:b/>
+                <w:bCs/>
+                <w:kern w:val="0"/>
+                <w:sz w:val="22"/>
+                <w:szCs w:val="22"/>
+                <w:lang w:eastAsia="es-ES"/>
+                <w14:ligatures w14:val="none"/>
+              </w:rPr>
+              <w:t>%</w:t>
+            </w:r>
+            <w:proofErr w:type="spellStart"/>
+            <w:r>
+              <w:rPr>
+                <w:rFonts w:ascii="Calibri" w:eastAsia="Times New Roman" w:hAnsi="Calibri" w:cs="Calibri"/>
+                <w:b/>
+                <w:bCs/>
+                <w:kern w:val="0"/>
+                <w:sz w:val="22"/>
+                <w:szCs w:val="22"/>
+                <w:lang w:eastAsia="es-ES"/>
+                <w14:ligatures w14:val="none"/>
+              </w:rPr>
+              <w:t>bpp_raw</w:t>
+            </w:r>
+            <w:proofErr w:type="spellEnd"/>
+          </w:p>
+        </w:tc>
+        <w:tc>
+          <w:tcPr>
+            <w:tcW w:w="1960" w:type="dxa"/>
+            <w:tcBorders>
+              <w:top w:val="single" w:sz="4" w:space="0" w:color="auto"/>
+              <w:left w:val="nil"/>
+              <w:bottom w:val="single" w:sz="4" w:space="0" w:color="auto"/>
+              <w:right w:val="single" w:sz="4" w:space="0" w:color="auto"/>
+            </w:tcBorders>
+            <w:noWrap/>
+            <w:hideMark/>
+          </w:tcPr>
+          <w:p>
+            <w:pPr>
+              <w:spacing w:after="0" w:line="240" w:lineRule="auto"/>
+              <w:jc w:val="center"/>
+              <w:rPr>
+                <w:rFonts w:ascii="Calibri" w:eastAsia="Times New Roman" w:hAnsi="Calibri" w:cs="Calibri"/>
+                <w:b/>
+                <w:bCs/>
+                <w:kern w:val="0"/>
+                <w:sz w:val="22"/>
+                <w:szCs w:val="22"/>
+                <w:lang w:eastAsia="es-ES"/>
+                <w14:ligatures w14:val="none"/>
+              </w:rPr>
+            </w:pPr>
+            <w:proofErr w:type="spellStart"/>
+            <w:r>
+              <w:rPr>
+                <w:rFonts w:ascii="Calibri" w:eastAsia="Times New Roman" w:hAnsi="Calibri" w:cs="Calibri"/>
+                <w:b/>
+                <w:bCs/>
+                <w:kern w:val="0"/>
+                <w:sz w:val="22"/>
+                <w:szCs w:val="22"/>
+                <w:lang w:eastAsia="es-ES"/>
+                <w14:ligatures w14:val="none"/>
+              </w:rPr>
+              <w:t>overhead_raw</w:t>
+            </w:r>
+            <w:proofErr w:type="spellEnd"/>
+            <w:r>
+              <w:rPr>
+                <w:rFonts w:ascii="Calibri" w:eastAsia="Times New Roman" w:hAnsi="Calibri" w:cs="Calibri"/>
+                <w:b/>
+                <w:bCs/>
+                <w:kern w:val="0"/>
+                <w:sz w:val="22"/>
+                <w:szCs w:val="22"/>
+                <w:lang w:eastAsia="es-ES"/>
+                <w14:ligatures w14:val="none"/>
+              </w:rPr>
+              <w:t>%</w:t>
+            </w:r>
+          </w:p>
+        </w:tc>
+        <w:tc>
+          <w:tcPr>
+            <w:tcW w:w="1661" w:type="dxa"/>
+            <w:tcBorders>
+              <w:top w:val="single" w:sz="4" w:space="0" w:color="auto"/>
+              <w:left w:val="nil"/>
+              <w:bottom w:val="single" w:sz="4" w:space="0" w:color="auto"/>
+              <w:right w:val="single" w:sz="4" w:space="0" w:color="auto"/>
+            </w:tcBorders>
+            <w:noWrap/>
+            <w:hideMark/>
+          </w:tcPr>
+          <w:p>
+            <w:pPr>
+              <w:spacing w:after="0" w:line="240" w:lineRule="auto"/>
+              <w:jc w:val="center"/>
+              <w:rPr>
+                <w:rFonts w:ascii="Calibri" w:eastAsia="Times New Roman" w:hAnsi="Calibri" w:cs="Calibri"/>
+                <w:b/>
+                <w:bCs/>
+                <w:kern w:val="0"/>
+                <w:sz w:val="22"/>
+                <w:szCs w:val="22"/>
+                <w:lang w:eastAsia="es-ES"/>
+                <w14:ligatures w14:val="none"/>
+              </w:rPr>
+            </w:pPr>
+            <w:r>
+              <w:rPr>
+                <w:rFonts w:ascii="Calibri" w:eastAsia="Times New Roman" w:hAnsi="Calibri" w:cs="Calibri"/>
+                <w:b/>
+                <w:bCs/>
+                <w:kern w:val="0"/>
+                <w:sz w:val="22"/>
+                <w:szCs w:val="22"/>
+                <w:lang w:eastAsia="es-ES"/>
+                <w14:ligatures w14:val="none"/>
+              </w:rPr>
+              <w:t>%</w:t>
+            </w:r>
+            <w:r>
+              <w:rPr>
+                <w:rFonts w:ascii="Calibri" w:eastAsia="Times New Roman" w:hAnsi="Calibri" w:cs="Calibri"/>
+                <w:b/>
+                <w:bCs/>
+                <w:kern w:val="0"/>
+                <w:sz w:val="22"/>
+                <w:szCs w:val="22"/>
+                <w:lang w:eastAsia="es-ES"/>
+                <w14:ligatures w14:val="none"/>
+              </w:rPr>
+              <w:t xml:space="preserve"> de eficiencia</w:t>
+            </w:r>
+            <w:r>
+              <w:rPr>
+                <w:rFonts w:ascii="Calibri" w:eastAsia="Times New Roman" w:hAnsi="Calibri" w:cs="Calibri"/>
+                <w:b/>
+                <w:bCs/>
+                <w:kern w:val="0"/>
+                <w:sz w:val="22"/>
+                <w:szCs w:val="22"/>
+                <w:lang w:eastAsia="es-ES"/>
+                <w14:ligatures w14:val="none"/>
+              </w:rPr>
+              <w:t xml:space="preserve"> total</w:t>
+            </w:r>
+            <w:r>
+              <w:rPr>
+                <w:rFonts w:ascii="Calibri" w:eastAsia="Times New Roman" w:hAnsi="Calibri" w:cs="Calibri"/>
+                <w:b/>
+                <w:bCs/>
+                <w:kern w:val="0"/>
+                <w:sz w:val="22"/>
+                <w:szCs w:val="22"/>
+                <w:lang w:eastAsia="es-ES"/>
+                <w14:ligatures w14:val="none"/>
+              </w:rPr>
+              <w:t xml:space="preserve"> perdida</w:t>
+            </w:r>
+          </w:p>
+        </w:tc>
+      </w:tr>
+      <w:tr>
+        <w:trPr>
+          <w:trHeight w:val="286"/>
+        </w:trPr>
+        <w:tc>
+          <w:tcPr>
+            <w:tcW w:w="1057" w:type="dxa"/>
+            <w:tcBorders>
+              <w:top w:val="nil"/>
+              <w:left w:val="single" w:sz="4" w:space="0" w:color="auto"/>
+              <w:bottom w:val="single" w:sz="4" w:space="0" w:color="auto"/>
+              <w:right w:val="single" w:sz="4" w:space="0" w:color="auto"/>
+            </w:tcBorders>
+            <w:noWrap/>
+            <w:vAlign w:val="bottom"/>
+            <w:hideMark/>
+          </w:tcPr>
+          <w:p>
+            <w:pPr>
+              <w:spacing w:after="0" w:line="240" w:lineRule="auto"/>
+              <w:jc w:val="center"/>
+              <w:rPr>
+                <w:rFonts w:ascii="Calibri" w:eastAsia="Times New Roman" w:hAnsi="Calibri" w:cs="Calibri"/>
+                <w:color w:val="000000"/>
+                <w:kern w:val="0"/>
+                <w:sz w:val="22"/>
+                <w:szCs w:val="22"/>
+                <w:lang w:eastAsia="es-ES"/>
+                <w14:ligatures w14:val="none"/>
+              </w:rPr>
+            </w:pPr>
+            <w:r>
+              <w:rPr>
+                <w:rFonts w:ascii="Calibri" w:eastAsia="Times New Roman" w:hAnsi="Calibri" w:cs="Calibri"/>
+                <w:color w:val="000000"/>
+                <w:kern w:val="0"/>
+                <w:sz w:val="22"/>
+                <w:szCs w:val="22"/>
+                <w:lang w:eastAsia="es-ES"/>
+                <w14:ligatures w14:val="none"/>
+              </w:rPr>
+              <w:t>4</w:t>
+            </w:r>
+          </w:p>
+        </w:tc>
+        <w:tc>
+          <w:tcPr>
+            <w:tcW w:w="1432" w:type="dxa"/>
+            <w:tcBorders>
+              <w:top w:val="nil"/>
+              <w:left w:val="nil"/>
+              <w:bottom w:val="single" w:sz="4" w:space="0" w:color="auto"/>
+              <w:right w:val="single" w:sz="4" w:space="0" w:color="auto"/>
+            </w:tcBorders>
+            <w:noWrap/>
+            <w:vAlign w:val="bottom"/>
+            <w:hideMark/>
+          </w:tcPr>
+          <w:p>
+            <w:pPr>
+              <w:spacing w:after="0" w:line="240" w:lineRule="auto"/>
+              <w:rPr>
+                <w:rFonts w:ascii="Calibri" w:eastAsia="Times New Roman" w:hAnsi="Calibri" w:cs="Calibri"/>
+                <w:color w:val="000000"/>
+                <w:kern w:val="0"/>
+                <w:sz w:val="22"/>
+                <w:szCs w:val="22"/>
+                <w:lang w:eastAsia="es-ES"/>
+                <w14:ligatures w14:val="none"/>
+              </w:rPr>
+            </w:pPr>
+            <w:r>
+              <w:rPr>
+                <w:rFonts w:ascii="Calibri" w:eastAsia="Times New Roman" w:hAnsi="Calibri" w:cs="Calibri"/>
+                <w:color w:val="000000"/>
+                <w:kern w:val="0"/>
+                <w:sz w:val="22"/>
+                <w:szCs w:val="22"/>
+                <w:lang w:eastAsia="es-ES"/>
+                <w14:ligatures w14:val="none"/>
+              </w:rPr>
+              <w:t xml:space="preserve">         91.0155 </w:t>
+            </w:r>
+          </w:p>
+        </w:tc>
+        <w:tc>
+          <w:tcPr>
+            <w:tcW w:w="1432" w:type="dxa"/>
+            <w:tcBorders>
+              <w:top w:val="nil"/>
+              <w:left w:val="nil"/>
+              <w:bottom w:val="single" w:sz="4" w:space="0" w:color="auto"/>
+              <w:right w:val="single" w:sz="4" w:space="0" w:color="auto"/>
+            </w:tcBorders>
+            <w:noWrap/>
+            <w:vAlign w:val="bottom"/>
+            <w:hideMark/>
+          </w:tcPr>
+          <w:p>
+            <w:pPr>
+              <w:spacing w:after="0" w:line="240" w:lineRule="auto"/>
+              <w:rPr>
+                <w:rFonts w:ascii="Calibri" w:eastAsia="Times New Roman" w:hAnsi="Calibri" w:cs="Calibri"/>
+                <w:color w:val="000000"/>
+                <w:kern w:val="0"/>
+                <w:sz w:val="22"/>
+                <w:szCs w:val="22"/>
+                <w:lang w:eastAsia="es-ES"/>
+                <w14:ligatures w14:val="none"/>
+              </w:rPr>
+            </w:pPr>
+            <w:r>
+              <w:rPr>
+                <w:rFonts w:ascii="Calibri" w:eastAsia="Times New Roman" w:hAnsi="Calibri" w:cs="Calibri"/>
+                <w:color w:val="000000"/>
+                <w:kern w:val="0"/>
+                <w:sz w:val="22"/>
+                <w:szCs w:val="22"/>
+                <w:lang w:eastAsia="es-ES"/>
+                <w14:ligatures w14:val="none"/>
+              </w:rPr>
+              <w:t xml:space="preserve">           8.9845 </w:t>
+            </w:r>
+          </w:p>
+        </w:tc>
+        <w:tc>
+          <w:tcPr>
+            <w:tcW w:w="1960" w:type="dxa"/>
+            <w:tcBorders>
+              <w:top w:val="nil"/>
+              <w:left w:val="nil"/>
+              <w:bottom w:val="single" w:sz="4" w:space="0" w:color="auto"/>
+              <w:right w:val="single" w:sz="4" w:space="0" w:color="auto"/>
+            </w:tcBorders>
+            <w:noWrap/>
+            <w:vAlign w:val="bottom"/>
+            <w:hideMark/>
+          </w:tcPr>
+          <w:p>
+            <w:pPr>
+              <w:spacing w:after="0" w:line="240" w:lineRule="auto"/>
+              <w:rPr>
+                <w:rFonts w:ascii="Calibri" w:eastAsia="Times New Roman" w:hAnsi="Calibri" w:cs="Calibri"/>
+                <w:color w:val="000000"/>
+                <w:kern w:val="0"/>
+                <w:sz w:val="22"/>
+                <w:szCs w:val="22"/>
+                <w:lang w:eastAsia="es-ES"/>
+                <w14:ligatures w14:val="none"/>
+              </w:rPr>
+            </w:pPr>
+            <w:r>
+              <w:rPr>
+                <w:rFonts w:ascii="Calibri" w:eastAsia="Times New Roman" w:hAnsi="Calibri" w:cs="Calibri"/>
+                <w:color w:val="000000"/>
+                <w:kern w:val="0"/>
+                <w:sz w:val="22"/>
+                <w:szCs w:val="22"/>
+                <w:lang w:eastAsia="es-ES"/>
+                <w14:ligatures w14:val="none"/>
+              </w:rPr>
+              <w:t xml:space="preserve">                   24.7657 </w:t>
+            </w:r>
+          </w:p>
+        </w:tc>
+        <w:tc>
+          <w:tcPr>
+            <w:tcW w:w="1661" w:type="dxa"/>
+            <w:tcBorders>
+              <w:top w:val="nil"/>
+              <w:left w:val="nil"/>
+              <w:bottom w:val="single" w:sz="4" w:space="0" w:color="auto"/>
+              <w:right w:val="single" w:sz="4" w:space="0" w:color="auto"/>
+            </w:tcBorders>
+            <w:noWrap/>
+            <w:vAlign w:val="bottom"/>
+            <w:hideMark/>
+          </w:tcPr>
+          <w:p>
+            <w:pPr>
+              <w:spacing w:after="0" w:line="240" w:lineRule="auto"/>
+              <w:rPr>
+                <w:rFonts w:ascii="Calibri" w:eastAsia="Times New Roman" w:hAnsi="Calibri" w:cs="Calibri"/>
+                <w:color w:val="000000"/>
+                <w:kern w:val="0"/>
+                <w:sz w:val="22"/>
+                <w:szCs w:val="22"/>
+                <w:lang w:eastAsia="es-ES"/>
+                <w14:ligatures w14:val="none"/>
+              </w:rPr>
+            </w:pPr>
+            <w:r>
+              <w:rPr>
+                <w:rFonts w:ascii="Calibri" w:eastAsia="Times New Roman" w:hAnsi="Calibri" w:cs="Calibri"/>
+                <w:color w:val="000000"/>
+                <w:kern w:val="0"/>
+                <w:sz w:val="22"/>
+                <w:szCs w:val="22"/>
+                <w:lang w:eastAsia="es-ES"/>
+                <w14:ligatures w14:val="none"/>
+              </w:rPr>
+              <w:t xml:space="preserve">               2.2251 </w:t>
+            </w:r>
+          </w:p>
+        </w:tc>
+      </w:tr>
+      <w:tr>
+        <w:trPr>
+          <w:trHeight w:val="286"/>
+        </w:trPr>
+        <w:tc>
+          <w:tcPr>
+            <w:tcW w:w="1057" w:type="dxa"/>
+            <w:tcBorders>
+              <w:top w:val="nil"/>
+              <w:left w:val="single" w:sz="4" w:space="0" w:color="auto"/>
+              <w:bottom w:val="single" w:sz="4" w:space="0" w:color="auto"/>
+              <w:right w:val="single" w:sz="4" w:space="0" w:color="auto"/>
+            </w:tcBorders>
+            <w:noWrap/>
+            <w:vAlign w:val="bottom"/>
+            <w:hideMark/>
+          </w:tcPr>
+          <w:p>
+            <w:pPr>
+              <w:spacing w:after="0" w:line="240" w:lineRule="auto"/>
+              <w:jc w:val="center"/>
+              <w:rPr>
+                <w:rFonts w:ascii="Calibri" w:eastAsia="Times New Roman" w:hAnsi="Calibri" w:cs="Calibri"/>
+                <w:color w:val="000000"/>
+                <w:kern w:val="0"/>
+                <w:sz w:val="22"/>
+                <w:szCs w:val="22"/>
+                <w:lang w:eastAsia="es-ES"/>
+                <w14:ligatures w14:val="none"/>
+              </w:rPr>
+            </w:pPr>
+            <w:r>
+              <w:rPr>
+                <w:rFonts w:ascii="Calibri" w:eastAsia="Times New Roman" w:hAnsi="Calibri" w:cs="Calibri"/>
+                <w:color w:val="000000"/>
+                <w:kern w:val="0"/>
+                <w:sz w:val="22"/>
+                <w:szCs w:val="22"/>
+                <w:lang w:eastAsia="es-ES"/>
+                <w14:ligatures w14:val="none"/>
+              </w:rPr>
+              <w:t>7</w:t>
+            </w:r>
+          </w:p>
+        </w:tc>
+        <w:tc>
+          <w:tcPr>
+            <w:tcW w:w="1432" w:type="dxa"/>
+            <w:tcBorders>
+              <w:top w:val="nil"/>
+              <w:left w:val="nil"/>
+              <w:bottom w:val="single" w:sz="4" w:space="0" w:color="auto"/>
+              <w:right w:val="single" w:sz="4" w:space="0" w:color="auto"/>
+            </w:tcBorders>
+            <w:noWrap/>
+            <w:vAlign w:val="bottom"/>
+            <w:hideMark/>
+          </w:tcPr>
+          <w:p>
+            <w:pPr>
+              <w:spacing w:after="0" w:line="240" w:lineRule="auto"/>
+              <w:rPr>
+                <w:rFonts w:ascii="Calibri" w:eastAsia="Times New Roman" w:hAnsi="Calibri" w:cs="Calibri"/>
+                <w:color w:val="000000"/>
+                <w:kern w:val="0"/>
+                <w:sz w:val="22"/>
+                <w:szCs w:val="22"/>
+                <w:lang w:eastAsia="es-ES"/>
+                <w14:ligatures w14:val="none"/>
+              </w:rPr>
+            </w:pPr>
+            <w:r>
+              <w:rPr>
+                <w:rFonts w:ascii="Calibri" w:eastAsia="Times New Roman" w:hAnsi="Calibri" w:cs="Calibri"/>
+                <w:color w:val="000000"/>
+                <w:kern w:val="0"/>
+                <w:sz w:val="22"/>
+                <w:szCs w:val="22"/>
+                <w:lang w:eastAsia="es-ES"/>
+                <w14:ligatures w14:val="none"/>
+              </w:rPr>
+              <w:t xml:space="preserve">         86.3330 </w:t>
+            </w:r>
+          </w:p>
+        </w:tc>
+        <w:tc>
+          <w:tcPr>
+            <w:tcW w:w="1432" w:type="dxa"/>
+            <w:tcBorders>
+              <w:top w:val="nil"/>
+              <w:left w:val="nil"/>
+              <w:bottom w:val="single" w:sz="4" w:space="0" w:color="auto"/>
+              <w:right w:val="single" w:sz="4" w:space="0" w:color="auto"/>
+            </w:tcBorders>
+            <w:noWrap/>
+            <w:vAlign w:val="bottom"/>
+            <w:hideMark/>
+          </w:tcPr>
+          <w:p>
+            <w:pPr>
+              <w:spacing w:after="0" w:line="240" w:lineRule="auto"/>
+              <w:rPr>
+                <w:rFonts w:ascii="Calibri" w:eastAsia="Times New Roman" w:hAnsi="Calibri" w:cs="Calibri"/>
+                <w:color w:val="000000"/>
+                <w:kern w:val="0"/>
+                <w:sz w:val="22"/>
+                <w:szCs w:val="22"/>
+                <w:lang w:eastAsia="es-ES"/>
+                <w14:ligatures w14:val="none"/>
+              </w:rPr>
+            </w:pPr>
+            <w:r>
+              <w:rPr>
+                <w:rFonts w:ascii="Calibri" w:eastAsia="Times New Roman" w:hAnsi="Calibri" w:cs="Calibri"/>
+                <w:color w:val="000000"/>
+                <w:kern w:val="0"/>
+                <w:sz w:val="22"/>
+                <w:szCs w:val="22"/>
+                <w:lang w:eastAsia="es-ES"/>
+                <w14:ligatures w14:val="none"/>
+              </w:rPr>
+              <w:t xml:space="preserve">         13.6670 </w:t>
+            </w:r>
+          </w:p>
+        </w:tc>
+        <w:tc>
+          <w:tcPr>
+            <w:tcW w:w="1960" w:type="dxa"/>
+            <w:tcBorders>
+              <w:top w:val="nil"/>
+              <w:left w:val="nil"/>
+              <w:bottom w:val="single" w:sz="4" w:space="0" w:color="auto"/>
+              <w:right w:val="single" w:sz="4" w:space="0" w:color="auto"/>
+            </w:tcBorders>
+            <w:noWrap/>
+            <w:vAlign w:val="bottom"/>
+            <w:hideMark/>
+          </w:tcPr>
+          <w:p>
+            <w:pPr>
+              <w:spacing w:after="0" w:line="240" w:lineRule="auto"/>
+              <w:rPr>
+                <w:rFonts w:ascii="Calibri" w:eastAsia="Times New Roman" w:hAnsi="Calibri" w:cs="Calibri"/>
+                <w:color w:val="000000"/>
+                <w:kern w:val="0"/>
+                <w:sz w:val="22"/>
+                <w:szCs w:val="22"/>
+                <w:lang w:eastAsia="es-ES"/>
+                <w14:ligatures w14:val="none"/>
+              </w:rPr>
+            </w:pPr>
+            <w:r>
+              <w:rPr>
+                <w:rFonts w:ascii="Calibri" w:eastAsia="Times New Roman" w:hAnsi="Calibri" w:cs="Calibri"/>
+                <w:color w:val="000000"/>
+                <w:kern w:val="0"/>
+                <w:sz w:val="22"/>
+                <w:szCs w:val="22"/>
+                <w:lang w:eastAsia="es-ES"/>
+                <w14:ligatures w14:val="none"/>
+              </w:rPr>
+              <w:t xml:space="preserve">                   23.8945 </w:t>
+            </w:r>
+          </w:p>
+        </w:tc>
+        <w:tc>
+          <w:tcPr>
+            <w:tcW w:w="1661" w:type="dxa"/>
+            <w:tcBorders>
+              <w:top w:val="nil"/>
+              <w:left w:val="nil"/>
+              <w:bottom w:val="single" w:sz="4" w:space="0" w:color="auto"/>
+              <w:right w:val="single" w:sz="4" w:space="0" w:color="auto"/>
+            </w:tcBorders>
+            <w:noWrap/>
+            <w:vAlign w:val="bottom"/>
+            <w:hideMark/>
+          </w:tcPr>
+          <w:p>
+            <w:pPr>
+              <w:spacing w:after="0" w:line="240" w:lineRule="auto"/>
+              <w:rPr>
+                <w:rFonts w:ascii="Calibri" w:eastAsia="Times New Roman" w:hAnsi="Calibri" w:cs="Calibri"/>
+                <w:color w:val="000000"/>
+                <w:kern w:val="0"/>
+                <w:sz w:val="22"/>
+                <w:szCs w:val="22"/>
+                <w:lang w:eastAsia="es-ES"/>
+                <w14:ligatures w14:val="none"/>
+              </w:rPr>
+            </w:pPr>
+            <w:r>
+              <w:rPr>
+                <w:rFonts w:ascii="Calibri" w:eastAsia="Times New Roman" w:hAnsi="Calibri" w:cs="Calibri"/>
+                <w:color w:val="000000"/>
+                <w:kern w:val="0"/>
+                <w:sz w:val="22"/>
+                <w:szCs w:val="22"/>
+                <w:lang w:eastAsia="es-ES"/>
+                <w14:ligatures w14:val="none"/>
+              </w:rPr>
+              <w:t xml:space="preserve">               3.2657 </w:t>
+            </w:r>
+          </w:p>
+        </w:tc>
+      </w:tr>
+      <w:tr>
+        <w:trPr>
+          <w:trHeight w:val="286"/>
+        </w:trPr>
+        <w:tc>
+          <w:tcPr>
+            <w:tcW w:w="1057" w:type="dxa"/>
+            <w:tcBorders>
+              <w:top w:val="nil"/>
+              <w:left w:val="single" w:sz="4" w:space="0" w:color="auto"/>
+              <w:bottom w:val="single" w:sz="4" w:space="0" w:color="auto"/>
+              <w:right w:val="single" w:sz="4" w:space="0" w:color="auto"/>
+            </w:tcBorders>
+            <w:noWrap/>
+            <w:vAlign w:val="bottom"/>
+            <w:hideMark/>
+          </w:tcPr>
+          <w:p>
+            <w:pPr>
+              <w:spacing w:after="0" w:line="240" w:lineRule="auto"/>
+              <w:jc w:val="center"/>
+              <w:rPr>
+                <w:rFonts w:ascii="Calibri" w:eastAsia="Times New Roman" w:hAnsi="Calibri" w:cs="Calibri"/>
+                <w:color w:val="000000"/>
+                <w:kern w:val="0"/>
+                <w:sz w:val="22"/>
+                <w:szCs w:val="22"/>
+                <w:lang w:eastAsia="es-ES"/>
+                <w14:ligatures w14:val="none"/>
+              </w:rPr>
+            </w:pPr>
+            <w:r>
+              <w:rPr>
+                <w:rFonts w:ascii="Calibri" w:eastAsia="Times New Roman" w:hAnsi="Calibri" w:cs="Calibri"/>
+                <w:color w:val="000000"/>
+                <w:kern w:val="0"/>
+                <w:sz w:val="22"/>
+                <w:szCs w:val="22"/>
+                <w:lang w:eastAsia="es-ES"/>
+                <w14:ligatures w14:val="none"/>
+              </w:rPr>
+              <w:t>9</w:t>
+            </w:r>
+          </w:p>
+        </w:tc>
+        <w:tc>
+          <w:tcPr>
+            <w:tcW w:w="1432" w:type="dxa"/>
+            <w:tcBorders>
+              <w:top w:val="nil"/>
+              <w:left w:val="nil"/>
+              <w:bottom w:val="single" w:sz="4" w:space="0" w:color="auto"/>
+              <w:right w:val="single" w:sz="4" w:space="0" w:color="auto"/>
+            </w:tcBorders>
+            <w:noWrap/>
+            <w:vAlign w:val="bottom"/>
+            <w:hideMark/>
+          </w:tcPr>
+          <w:p>
+            <w:pPr>
+              <w:spacing w:after="0" w:line="240" w:lineRule="auto"/>
+              <w:rPr>
+                <w:rFonts w:ascii="Calibri" w:eastAsia="Times New Roman" w:hAnsi="Calibri" w:cs="Calibri"/>
+                <w:color w:val="000000"/>
+                <w:kern w:val="0"/>
+                <w:sz w:val="22"/>
+                <w:szCs w:val="22"/>
+                <w:lang w:eastAsia="es-ES"/>
+                <w14:ligatures w14:val="none"/>
+              </w:rPr>
+            </w:pPr>
+            <w:r>
+              <w:rPr>
+                <w:rFonts w:ascii="Calibri" w:eastAsia="Times New Roman" w:hAnsi="Calibri" w:cs="Calibri"/>
+                <w:color w:val="000000"/>
+                <w:kern w:val="0"/>
+                <w:sz w:val="22"/>
+                <w:szCs w:val="22"/>
+                <w:lang w:eastAsia="es-ES"/>
+                <w14:ligatures w14:val="none"/>
+              </w:rPr>
+              <w:t xml:space="preserve">         79.2955 </w:t>
+            </w:r>
+          </w:p>
+        </w:tc>
+        <w:tc>
+          <w:tcPr>
+            <w:tcW w:w="1432" w:type="dxa"/>
+            <w:tcBorders>
+              <w:top w:val="nil"/>
+              <w:left w:val="nil"/>
+              <w:bottom w:val="single" w:sz="4" w:space="0" w:color="auto"/>
+              <w:right w:val="single" w:sz="4" w:space="0" w:color="auto"/>
+            </w:tcBorders>
+            <w:noWrap/>
+            <w:vAlign w:val="bottom"/>
+            <w:hideMark/>
+          </w:tcPr>
+          <w:p>
+            <w:pPr>
+              <w:spacing w:after="0" w:line="240" w:lineRule="auto"/>
+              <w:rPr>
+                <w:rFonts w:ascii="Calibri" w:eastAsia="Times New Roman" w:hAnsi="Calibri" w:cs="Calibri"/>
+                <w:color w:val="000000"/>
+                <w:kern w:val="0"/>
+                <w:sz w:val="22"/>
+                <w:szCs w:val="22"/>
+                <w:lang w:eastAsia="es-ES"/>
+                <w14:ligatures w14:val="none"/>
+              </w:rPr>
+            </w:pPr>
+            <w:r>
+              <w:rPr>
+                <w:rFonts w:ascii="Calibri" w:eastAsia="Times New Roman" w:hAnsi="Calibri" w:cs="Calibri"/>
+                <w:color w:val="000000"/>
+                <w:kern w:val="0"/>
+                <w:sz w:val="22"/>
+                <w:szCs w:val="22"/>
+                <w:lang w:eastAsia="es-ES"/>
+                <w14:ligatures w14:val="none"/>
+              </w:rPr>
+              <w:t xml:space="preserve">         20.7045 </w:t>
+            </w:r>
+          </w:p>
+        </w:tc>
+        <w:tc>
+          <w:tcPr>
+            <w:tcW w:w="1960" w:type="dxa"/>
+            <w:tcBorders>
+              <w:top w:val="nil"/>
+              <w:left w:val="nil"/>
+              <w:bottom w:val="single" w:sz="4" w:space="0" w:color="auto"/>
+              <w:right w:val="single" w:sz="4" w:space="0" w:color="auto"/>
+            </w:tcBorders>
+            <w:noWrap/>
+            <w:vAlign w:val="bottom"/>
+            <w:hideMark/>
+          </w:tcPr>
+          <w:p>
+            <w:pPr>
+              <w:spacing w:after="0" w:line="240" w:lineRule="auto"/>
+              <w:rPr>
+                <w:rFonts w:ascii="Calibri" w:eastAsia="Times New Roman" w:hAnsi="Calibri" w:cs="Calibri"/>
+                <w:color w:val="000000"/>
+                <w:kern w:val="0"/>
+                <w:sz w:val="22"/>
+                <w:szCs w:val="22"/>
+                <w:lang w:eastAsia="es-ES"/>
+                <w14:ligatures w14:val="none"/>
+              </w:rPr>
+            </w:pPr>
+            <w:r>
+              <w:rPr>
+                <w:rFonts w:ascii="Calibri" w:eastAsia="Times New Roman" w:hAnsi="Calibri" w:cs="Calibri"/>
+                <w:color w:val="000000"/>
+                <w:kern w:val="0"/>
+                <w:sz w:val="22"/>
+                <w:szCs w:val="22"/>
+                <w:lang w:eastAsia="es-ES"/>
+                <w14:ligatures w14:val="none"/>
+              </w:rPr>
+              <w:t xml:space="preserve">                   39.1435 </w:t>
+            </w:r>
+          </w:p>
+        </w:tc>
+        <w:tc>
+          <w:tcPr>
+            <w:tcW w:w="1661" w:type="dxa"/>
+            <w:tcBorders>
+              <w:top w:val="nil"/>
+              <w:left w:val="nil"/>
+              <w:bottom w:val="single" w:sz="4" w:space="0" w:color="auto"/>
+              <w:right w:val="single" w:sz="4" w:space="0" w:color="auto"/>
+            </w:tcBorders>
+            <w:noWrap/>
+            <w:vAlign w:val="bottom"/>
+            <w:hideMark/>
+          </w:tcPr>
+          <w:p>
+            <w:pPr>
+              <w:spacing w:after="0" w:line="240" w:lineRule="auto"/>
+              <w:rPr>
+                <w:rFonts w:ascii="Calibri" w:eastAsia="Times New Roman" w:hAnsi="Calibri" w:cs="Calibri"/>
+                <w:color w:val="000000"/>
+                <w:kern w:val="0"/>
+                <w:sz w:val="22"/>
+                <w:szCs w:val="22"/>
+                <w:lang w:eastAsia="es-ES"/>
+                <w14:ligatures w14:val="none"/>
+              </w:rPr>
+            </w:pPr>
+            <w:r>
+              <w:rPr>
+                <w:rFonts w:ascii="Calibri" w:eastAsia="Times New Roman" w:hAnsi="Calibri" w:cs="Calibri"/>
+                <w:color w:val="000000"/>
+                <w:kern w:val="0"/>
+                <w:sz w:val="22"/>
+                <w:szCs w:val="22"/>
+                <w:lang w:eastAsia="es-ES"/>
+                <w14:ligatures w14:val="none"/>
+              </w:rPr>
+              <w:t xml:space="preserve">               8.1045 </w:t>
+            </w:r>
+          </w:p>
+        </w:tc>
+      </w:tr>
+      <w:tr>
+        <w:trPr>
+          <w:trHeight w:val="286"/>
+        </w:trPr>
+        <w:tc>
+          <w:tcPr>
+            <w:tcW w:w="1057" w:type="dxa"/>
+            <w:tcBorders>
+              <w:top w:val="nil"/>
+              <w:left w:val="single" w:sz="4" w:space="0" w:color="auto"/>
+              <w:bottom w:val="single" w:sz="4" w:space="0" w:color="auto"/>
+              <w:right w:val="single" w:sz="4" w:space="0" w:color="auto"/>
+            </w:tcBorders>
+            <w:noWrap/>
+            <w:vAlign w:val="bottom"/>
+            <w:hideMark/>
+          </w:tcPr>
+          <w:p>
+            <w:pPr>
+              <w:spacing w:after="0" w:line="240" w:lineRule="auto"/>
+              <w:jc w:val="center"/>
+              <w:rPr>
+                <w:rFonts w:ascii="Calibri" w:eastAsia="Times New Roman" w:hAnsi="Calibri" w:cs="Calibri"/>
+                <w:color w:val="000000"/>
+                <w:kern w:val="0"/>
+                <w:sz w:val="22"/>
+                <w:szCs w:val="22"/>
+                <w:lang w:eastAsia="es-ES"/>
+                <w14:ligatures w14:val="none"/>
+              </w:rPr>
+            </w:pPr>
+            <w:r>
+              <w:rPr>
+                <w:rFonts w:ascii="Calibri" w:eastAsia="Times New Roman" w:hAnsi="Calibri" w:cs="Calibri"/>
+                <w:color w:val="000000"/>
+                <w:kern w:val="0"/>
+                <w:sz w:val="22"/>
+                <w:szCs w:val="22"/>
+                <w:lang w:eastAsia="es-ES"/>
+                <w14:ligatures w14:val="none"/>
+              </w:rPr>
+              <w:t>17</w:t>
+            </w:r>
+          </w:p>
+        </w:tc>
+        <w:tc>
+          <w:tcPr>
+            <w:tcW w:w="1432" w:type="dxa"/>
+            <w:tcBorders>
+              <w:top w:val="nil"/>
+              <w:left w:val="nil"/>
+              <w:bottom w:val="single" w:sz="4" w:space="0" w:color="auto"/>
+              <w:right w:val="single" w:sz="4" w:space="0" w:color="auto"/>
+            </w:tcBorders>
+            <w:noWrap/>
+            <w:vAlign w:val="bottom"/>
+            <w:hideMark/>
+          </w:tcPr>
+          <w:p>
+            <w:pPr>
+              <w:spacing w:after="0" w:line="240" w:lineRule="auto"/>
+              <w:rPr>
+                <w:rFonts w:ascii="Calibri" w:eastAsia="Times New Roman" w:hAnsi="Calibri" w:cs="Calibri"/>
+                <w:color w:val="000000"/>
+                <w:kern w:val="0"/>
+                <w:sz w:val="22"/>
+                <w:szCs w:val="22"/>
+                <w:lang w:eastAsia="es-ES"/>
+                <w14:ligatures w14:val="none"/>
+              </w:rPr>
+            </w:pPr>
+            <w:r>
+              <w:rPr>
+                <w:rFonts w:ascii="Calibri" w:eastAsia="Times New Roman" w:hAnsi="Calibri" w:cs="Calibri"/>
+                <w:color w:val="000000"/>
+                <w:kern w:val="0"/>
+                <w:sz w:val="22"/>
+                <w:szCs w:val="22"/>
+                <w:lang w:eastAsia="es-ES"/>
+                <w14:ligatures w14:val="none"/>
+              </w:rPr>
+              <w:t xml:space="preserve">         69.5448 </w:t>
+            </w:r>
+          </w:p>
+        </w:tc>
+        <w:tc>
+          <w:tcPr>
+            <w:tcW w:w="1432" w:type="dxa"/>
+            <w:tcBorders>
+              <w:top w:val="nil"/>
+              <w:left w:val="nil"/>
+              <w:bottom w:val="single" w:sz="4" w:space="0" w:color="auto"/>
+              <w:right w:val="single" w:sz="4" w:space="0" w:color="auto"/>
+            </w:tcBorders>
+            <w:noWrap/>
+            <w:vAlign w:val="bottom"/>
+            <w:hideMark/>
+          </w:tcPr>
+          <w:p>
+            <w:pPr>
+              <w:spacing w:after="0" w:line="240" w:lineRule="auto"/>
+              <w:rPr>
+                <w:rFonts w:ascii="Calibri" w:eastAsia="Times New Roman" w:hAnsi="Calibri" w:cs="Calibri"/>
+                <w:color w:val="000000"/>
+                <w:kern w:val="0"/>
+                <w:sz w:val="22"/>
+                <w:szCs w:val="22"/>
+                <w:lang w:eastAsia="es-ES"/>
+                <w14:ligatures w14:val="none"/>
+              </w:rPr>
+            </w:pPr>
+            <w:r>
+              <w:rPr>
+                <w:rFonts w:ascii="Calibri" w:eastAsia="Times New Roman" w:hAnsi="Calibri" w:cs="Calibri"/>
+                <w:color w:val="000000"/>
+                <w:kern w:val="0"/>
+                <w:sz w:val="22"/>
+                <w:szCs w:val="22"/>
+                <w:lang w:eastAsia="es-ES"/>
+                <w14:ligatures w14:val="none"/>
+              </w:rPr>
+              <w:t xml:space="preserve">         30.4552 </w:t>
+            </w:r>
+          </w:p>
+        </w:tc>
+        <w:tc>
+          <w:tcPr>
+            <w:tcW w:w="1960" w:type="dxa"/>
+            <w:tcBorders>
+              <w:top w:val="nil"/>
+              <w:left w:val="nil"/>
+              <w:bottom w:val="single" w:sz="4" w:space="0" w:color="auto"/>
+              <w:right w:val="single" w:sz="4" w:space="0" w:color="auto"/>
+            </w:tcBorders>
+            <w:noWrap/>
+            <w:vAlign w:val="bottom"/>
+            <w:hideMark/>
+          </w:tcPr>
+          <w:p>
+            <w:pPr>
+              <w:spacing w:after="0" w:line="240" w:lineRule="auto"/>
+              <w:rPr>
+                <w:rFonts w:ascii="Calibri" w:eastAsia="Times New Roman" w:hAnsi="Calibri" w:cs="Calibri"/>
+                <w:color w:val="000000"/>
+                <w:kern w:val="0"/>
+                <w:sz w:val="22"/>
+                <w:szCs w:val="22"/>
+                <w:lang w:eastAsia="es-ES"/>
+                <w14:ligatures w14:val="none"/>
+              </w:rPr>
+            </w:pPr>
+            <w:r>
+              <w:rPr>
+                <w:rFonts w:ascii="Calibri" w:eastAsia="Times New Roman" w:hAnsi="Calibri" w:cs="Calibri"/>
+                <w:color w:val="000000"/>
+                <w:kern w:val="0"/>
+                <w:sz w:val="22"/>
+                <w:szCs w:val="22"/>
+                <w:lang w:eastAsia="es-ES"/>
+                <w14:ligatures w14:val="none"/>
+              </w:rPr>
+              <w:t xml:space="preserve">                   32.4692 </w:t>
+            </w:r>
+          </w:p>
+        </w:tc>
+        <w:tc>
+          <w:tcPr>
+            <w:tcW w:w="1661" w:type="dxa"/>
+            <w:tcBorders>
+              <w:top w:val="nil"/>
+              <w:left w:val="nil"/>
+              <w:bottom w:val="single" w:sz="4" w:space="0" w:color="auto"/>
+              <w:right w:val="single" w:sz="4" w:space="0" w:color="auto"/>
+            </w:tcBorders>
+            <w:noWrap/>
+            <w:vAlign w:val="bottom"/>
+            <w:hideMark/>
+          </w:tcPr>
+          <w:p>
+            <w:pPr>
+              <w:spacing w:after="0" w:line="240" w:lineRule="auto"/>
+              <w:rPr>
+                <w:rFonts w:ascii="Calibri" w:eastAsia="Times New Roman" w:hAnsi="Calibri" w:cs="Calibri"/>
+                <w:color w:val="000000"/>
+                <w:kern w:val="0"/>
+                <w:sz w:val="22"/>
+                <w:szCs w:val="22"/>
+                <w:lang w:eastAsia="es-ES"/>
+                <w14:ligatures w14:val="none"/>
+              </w:rPr>
+            </w:pPr>
+            <w:r>
+              <w:rPr>
+                <w:rFonts w:ascii="Calibri" w:eastAsia="Times New Roman" w:hAnsi="Calibri" w:cs="Calibri"/>
+                <w:color w:val="000000"/>
+                <w:kern w:val="0"/>
+                <w:sz w:val="22"/>
+                <w:szCs w:val="22"/>
+                <w:lang w:eastAsia="es-ES"/>
+                <w14:ligatures w14:val="none"/>
+              </w:rPr>
+              <w:t xml:space="preserve">               9.8886 </w:t>
+            </w:r>
+          </w:p>
+        </w:tc>
+      </w:tr>
+      <w:tr>
+        <w:trPr>
+          <w:trHeight w:val="286"/>
+        </w:trPr>
+        <w:tc>
+          <w:tcPr>
+            <w:tcW w:w="1057" w:type="dxa"/>
+            <w:tcBorders>
+              <w:top w:val="nil"/>
+              <w:left w:val="single" w:sz="4" w:space="0" w:color="auto"/>
+              <w:bottom w:val="single" w:sz="4" w:space="0" w:color="auto"/>
+              <w:right w:val="single" w:sz="4" w:space="0" w:color="auto"/>
+            </w:tcBorders>
+            <w:noWrap/>
+            <w:vAlign w:val="bottom"/>
+            <w:hideMark/>
+          </w:tcPr>
+          <w:p>
+            <w:pPr>
+              <w:spacing w:after="0" w:line="240" w:lineRule="auto"/>
+              <w:jc w:val="center"/>
+              <w:rPr>
+                <w:rFonts w:ascii="Calibri" w:eastAsia="Times New Roman" w:hAnsi="Calibri" w:cs="Calibri"/>
+                <w:color w:val="000000"/>
+                <w:kern w:val="0"/>
+                <w:sz w:val="22"/>
+                <w:szCs w:val="22"/>
+                <w:lang w:eastAsia="es-ES"/>
+                <w14:ligatures w14:val="none"/>
+              </w:rPr>
+            </w:pPr>
+            <w:r>
+              <w:rPr>
+                <w:rFonts w:ascii="Calibri" w:eastAsia="Times New Roman" w:hAnsi="Calibri" w:cs="Calibri"/>
+                <w:color w:val="000000"/>
+                <w:kern w:val="0"/>
+                <w:sz w:val="22"/>
+                <w:szCs w:val="22"/>
+                <w:lang w:eastAsia="es-ES"/>
+                <w14:ligatures w14:val="none"/>
+              </w:rPr>
+              <w:t>32</w:t>
+            </w:r>
+          </w:p>
+        </w:tc>
+        <w:tc>
+          <w:tcPr>
+            <w:tcW w:w="1432" w:type="dxa"/>
+            <w:tcBorders>
+              <w:top w:val="nil"/>
+              <w:left w:val="nil"/>
+              <w:bottom w:val="single" w:sz="4" w:space="0" w:color="auto"/>
+              <w:right w:val="single" w:sz="4" w:space="0" w:color="auto"/>
+            </w:tcBorders>
+            <w:noWrap/>
+            <w:vAlign w:val="bottom"/>
+            <w:hideMark/>
+          </w:tcPr>
+          <w:p>
+            <w:pPr>
+              <w:spacing w:after="0" w:line="240" w:lineRule="auto"/>
+              <w:rPr>
+                <w:rFonts w:ascii="Calibri" w:eastAsia="Times New Roman" w:hAnsi="Calibri" w:cs="Calibri"/>
+                <w:color w:val="000000"/>
+                <w:kern w:val="0"/>
+                <w:sz w:val="22"/>
+                <w:szCs w:val="22"/>
+                <w:lang w:eastAsia="es-ES"/>
+                <w14:ligatures w14:val="none"/>
+              </w:rPr>
+            </w:pPr>
+            <w:r>
+              <w:rPr>
+                <w:rFonts w:ascii="Calibri" w:eastAsia="Times New Roman" w:hAnsi="Calibri" w:cs="Calibri"/>
+                <w:color w:val="000000"/>
+                <w:kern w:val="0"/>
+                <w:sz w:val="22"/>
+                <w:szCs w:val="22"/>
+                <w:lang w:eastAsia="es-ES"/>
+                <w14:ligatures w14:val="none"/>
+              </w:rPr>
+              <w:t xml:space="preserve">         54.1587 </w:t>
+            </w:r>
+          </w:p>
+        </w:tc>
+        <w:tc>
+          <w:tcPr>
+            <w:tcW w:w="1432" w:type="dxa"/>
+            <w:tcBorders>
+              <w:top w:val="nil"/>
+              <w:left w:val="nil"/>
+              <w:bottom w:val="single" w:sz="4" w:space="0" w:color="auto"/>
+              <w:right w:val="single" w:sz="4" w:space="0" w:color="auto"/>
+            </w:tcBorders>
+            <w:noWrap/>
+            <w:vAlign w:val="bottom"/>
+            <w:hideMark/>
+          </w:tcPr>
+          <w:p>
+            <w:pPr>
+              <w:spacing w:after="0" w:line="240" w:lineRule="auto"/>
+              <w:rPr>
+                <w:rFonts w:ascii="Calibri" w:eastAsia="Times New Roman" w:hAnsi="Calibri" w:cs="Calibri"/>
+                <w:color w:val="000000"/>
+                <w:kern w:val="0"/>
+                <w:sz w:val="22"/>
+                <w:szCs w:val="22"/>
+                <w:lang w:eastAsia="es-ES"/>
+                <w14:ligatures w14:val="none"/>
+              </w:rPr>
+            </w:pPr>
+            <w:r>
+              <w:rPr>
+                <w:rFonts w:ascii="Calibri" w:eastAsia="Times New Roman" w:hAnsi="Calibri" w:cs="Calibri"/>
+                <w:color w:val="000000"/>
+                <w:kern w:val="0"/>
+                <w:sz w:val="22"/>
+                <w:szCs w:val="22"/>
+                <w:lang w:eastAsia="es-ES"/>
+                <w14:ligatures w14:val="none"/>
+              </w:rPr>
+              <w:t xml:space="preserve">         45.8413 </w:t>
+            </w:r>
+          </w:p>
+        </w:tc>
+        <w:tc>
+          <w:tcPr>
+            <w:tcW w:w="1960" w:type="dxa"/>
+            <w:tcBorders>
+              <w:top w:val="nil"/>
+              <w:left w:val="nil"/>
+              <w:bottom w:val="single" w:sz="4" w:space="0" w:color="auto"/>
+              <w:right w:val="single" w:sz="4" w:space="0" w:color="auto"/>
+            </w:tcBorders>
+            <w:noWrap/>
+            <w:vAlign w:val="bottom"/>
+            <w:hideMark/>
+          </w:tcPr>
+          <w:p>
+            <w:pPr>
+              <w:spacing w:after="0" w:line="240" w:lineRule="auto"/>
+              <w:rPr>
+                <w:rFonts w:ascii="Calibri" w:eastAsia="Times New Roman" w:hAnsi="Calibri" w:cs="Calibri"/>
+                <w:color w:val="000000"/>
+                <w:kern w:val="0"/>
+                <w:sz w:val="22"/>
+                <w:szCs w:val="22"/>
+                <w:lang w:eastAsia="es-ES"/>
+                <w14:ligatures w14:val="none"/>
+              </w:rPr>
+            </w:pPr>
+            <w:r>
+              <w:rPr>
+                <w:rFonts w:ascii="Calibri" w:eastAsia="Times New Roman" w:hAnsi="Calibri" w:cs="Calibri"/>
+                <w:color w:val="000000"/>
+                <w:kern w:val="0"/>
+                <w:sz w:val="22"/>
+                <w:szCs w:val="22"/>
+                <w:lang w:eastAsia="es-ES"/>
+                <w14:ligatures w14:val="none"/>
+              </w:rPr>
+              <w:t xml:space="preserve">                     8.2641 </w:t>
+            </w:r>
+          </w:p>
+        </w:tc>
+        <w:tc>
+          <w:tcPr>
+            <w:tcW w:w="1661" w:type="dxa"/>
+            <w:tcBorders>
+              <w:top w:val="nil"/>
+              <w:left w:val="nil"/>
+              <w:bottom w:val="single" w:sz="4" w:space="0" w:color="auto"/>
+              <w:right w:val="single" w:sz="4" w:space="0" w:color="auto"/>
+            </w:tcBorders>
+            <w:noWrap/>
+            <w:vAlign w:val="bottom"/>
+            <w:hideMark/>
+          </w:tcPr>
+          <w:p>
+            <w:pPr>
+              <w:spacing w:after="0" w:line="240" w:lineRule="auto"/>
+              <w:rPr>
+                <w:rFonts w:ascii="Calibri" w:eastAsia="Times New Roman" w:hAnsi="Calibri" w:cs="Calibri"/>
+                <w:color w:val="000000"/>
+                <w:kern w:val="0"/>
+                <w:sz w:val="22"/>
+                <w:szCs w:val="22"/>
+                <w:lang w:eastAsia="es-ES"/>
+                <w14:ligatures w14:val="none"/>
+              </w:rPr>
+            </w:pPr>
+            <w:r>
+              <w:rPr>
+                <w:rFonts w:ascii="Calibri" w:eastAsia="Times New Roman" w:hAnsi="Calibri" w:cs="Calibri"/>
+                <w:color w:val="000000"/>
+                <w:kern w:val="0"/>
+                <w:sz w:val="22"/>
+                <w:szCs w:val="22"/>
+                <w:lang w:eastAsia="es-ES"/>
+                <w14:ligatures w14:val="none"/>
+              </w:rPr>
+              <w:t xml:space="preserve">               3.7884 </w:t>
+            </w:r>
+          </w:p>
+        </w:tc>
+      </w:tr>
+    </w:tbl>
+    <w:p>
+      <w:pPr>
+        <w:rPr>
+          <w:rFonts w:ascii="Times New Roman" w:hAnsi="Times New Roman" w:cs="Times New Roman"/>
+        </w:rPr>
+      </w:pPr>
+    </w:p>
+    <w:p>
+      <w:pPr>
+        <w:rPr>
+          <w:rFonts w:ascii="Times New Roman" w:hAnsi="Times New Roman" w:cs="Times New Roman"/>
+        </w:rPr>
+      </w:pPr>
+      <w:r>
+        <w:rPr>
+          <w:rFonts w:ascii="Times New Roman" w:hAnsi="Times New Roman" w:cs="Times New Roman"/>
+        </w:rPr>
+        <w:t xml:space="preserve">La Tabla 2 analiza la composición del </w:t>
+      </w:r>
+      <w:proofErr w:type="spellStart"/>
+      <w:r>
+        <w:rPr>
+          <w:rFonts w:ascii="Times New Roman" w:hAnsi="Times New Roman" w:cs="Times New Roman"/>
+        </w:rPr>
+        <w:t>bitstream</w:t>
+      </w:r>
+      <w:proofErr w:type="spellEnd"/>
+      <w:r>
+        <w:rPr>
+          <w:rFonts w:ascii="Times New Roman" w:hAnsi="Times New Roman" w:cs="Times New Roman"/>
+        </w:rPr>
+        <w:t xml:space="preserve"> final y la eficiencia perdida por transmitir los valores crudos sin codificar. La columna %</w:t>
+      </w:r>
+      <w:proofErr w:type="spellStart"/>
+      <w:r>
+        <w:rPr>
+          <w:rFonts w:ascii="Times New Roman" w:hAnsi="Times New Roman" w:cs="Times New Roman"/>
+        </w:rPr>
+        <w:t>bpp_raw</w:t>
+      </w:r>
+      <w:proofErr w:type="spellEnd"/>
+      <w:r>
+        <w:rPr>
+          <w:rFonts w:ascii="Times New Roman" w:hAnsi="Times New Roman" w:cs="Times New Roman"/>
+        </w:rPr>
+        <w:t xml:space="preserve"> muestra que la fracción del </w:t>
+      </w:r>
+      <w:proofErr w:type="spellStart"/>
+      <w:r>
+        <w:rPr>
+          <w:rFonts w:ascii="Times New Roman" w:hAnsi="Times New Roman" w:cs="Times New Roman"/>
+        </w:rPr>
+        <w:t>bitstream</w:t>
+      </w:r>
+      <w:proofErr w:type="spellEnd"/>
+      <w:r>
+        <w:rPr>
+          <w:rFonts w:ascii="Times New Roman" w:hAnsi="Times New Roman" w:cs="Times New Roman"/>
+        </w:rPr>
+        <w:t xml:space="preserve"> ocupada por los valores crudos crece consistentemente con el número de clases, pasando del 8.98% con 4 clases al 45.84% con 32 clases. Sin </w:t>
+      </w:r>
+      <w:r>
+        <w:rPr>
+          <w:rFonts w:ascii="Times New Roman" w:hAnsi="Times New Roman" w:cs="Times New Roman"/>
+        </w:rPr>
+        <w:lastRenderedPageBreak/>
+        <w:t xml:space="preserve">embargo, el </w:t>
+      </w:r>
+      <w:proofErr w:type="spellStart"/>
+      <w:r>
+        <w:rPr>
+          <w:rFonts w:ascii="Times New Roman" w:hAnsi="Times New Roman" w:cs="Times New Roman"/>
+        </w:rPr>
+        <w:t>overhead_raw</w:t>
+      </w:r>
+      <w:proofErr w:type="spellEnd"/>
+      <w:r>
+        <w:rPr>
+          <w:rFonts w:ascii="Times New Roman" w:hAnsi="Times New Roman" w:cs="Times New Roman"/>
+        </w:rPr>
+        <w:t xml:space="preserve">% — que indica </w:t>
+      </w:r>
+      <w:r>
+        <w:rPr>
+          <w:rFonts w:ascii="Times New Roman" w:hAnsi="Times New Roman" w:cs="Times New Roman"/>
+        </w:rPr>
+        <w:t>que</w:t>
+      </w:r>
+      <w:r>
+        <w:rPr>
+          <w:rFonts w:ascii="Times New Roman" w:hAnsi="Times New Roman" w:cs="Times New Roman"/>
+        </w:rPr>
+        <w:t xml:space="preserve"> el</w:t>
+      </w:r>
+      <w:r>
+        <w:rPr>
+          <w:rFonts w:ascii="Times New Roman" w:hAnsi="Times New Roman" w:cs="Times New Roman"/>
+        </w:rPr>
+        <w:t xml:space="preserve"> porcentaje de esos valores crudos son bits desperdiciados por no aplicar codificación por entropía — no sigue esta misma tendencia, sino que alcanza su punto máximo en 9 clases (39.14%) y decrece para 32 clases (8.26%). Esto</w:t>
+      </w:r>
+      <w:r>
+        <w:rPr>
+          <w:rFonts w:ascii="Times New Roman" w:hAnsi="Times New Roman" w:cs="Times New Roman"/>
+        </w:rPr>
+        <w:t xml:space="preserve"> podría ser debido a que</w:t>
+      </w:r>
+      <w:r>
+        <w:rPr>
+          <w:rFonts w:ascii="Times New Roman" w:hAnsi="Times New Roman" w:cs="Times New Roman"/>
+        </w:rPr>
+        <w:t>, con 32 clases, al ser potencia de 2,</w:t>
+      </w:r>
+      <w:r>
+        <w:rPr>
+          <w:rFonts w:ascii="Times New Roman" w:hAnsi="Times New Roman" w:cs="Times New Roman"/>
+        </w:rPr>
+        <w:t xml:space="preserve"> la</w:t>
+      </w:r>
+      <w:r>
+        <w:rPr>
+          <w:rFonts w:ascii="Times New Roman" w:hAnsi="Times New Roman" w:cs="Times New Roman"/>
+        </w:rPr>
+        <w:t xml:space="preserve"> tasa de bit por </w:t>
+      </w:r>
+      <w:r>
+        <w:rPr>
+          <w:rFonts w:ascii="Times New Roman" w:hAnsi="Times New Roman" w:cs="Times New Roman"/>
+        </w:rPr>
+        <w:t>píxel</w:t>
+      </w:r>
+      <w:r>
+        <w:rPr>
+          <w:rFonts w:ascii="Times New Roman" w:hAnsi="Times New Roman" w:cs="Times New Roman"/>
+        </w:rPr>
+        <w:t xml:space="preserve"> de</w:t>
+      </w:r>
+      <w:r>
+        <w:rPr>
+          <w:rFonts w:ascii="Times New Roman" w:hAnsi="Times New Roman" w:cs="Times New Roman"/>
+        </w:rPr>
+        <w:t xml:space="preserve"> la representación fija de </w:t>
+      </w:r>
+      <w:proofErr w:type="spellStart"/>
+      <w:r>
+        <w:rPr>
+          <w:rFonts w:ascii="Times New Roman" w:hAnsi="Times New Roman" w:cs="Times New Roman"/>
+        </w:rPr>
+        <w:t>ceil</w:t>
+      </w:r>
+      <w:proofErr w:type="spellEnd"/>
+      <w:r>
+        <w:rPr>
+          <w:rFonts w:ascii="Times New Roman" w:hAnsi="Times New Roman" w:cs="Times New Roman"/>
+        </w:rPr>
+        <w:t>(log2(32)) = 5 bits se aproximan más al límite teórico</w:t>
+      </w:r>
+      <w:r>
+        <w:rPr>
+          <w:rFonts w:ascii="Times New Roman" w:hAnsi="Times New Roman" w:cs="Times New Roman"/>
+        </w:rPr>
+        <w:t xml:space="preserve"> de lo valores crudos</w:t>
+      </w:r>
+      <w:r>
+        <w:rPr>
+          <w:rFonts w:ascii="Times New Roman" w:hAnsi="Times New Roman" w:cs="Times New Roman"/>
+        </w:rPr>
+        <w:t xml:space="preserve">, mientras que con 9 clases el redondeo de </w:t>
+      </w:r>
+      <w:proofErr w:type="spellStart"/>
+      <w:r>
+        <w:rPr>
+          <w:rFonts w:ascii="Times New Roman" w:hAnsi="Times New Roman" w:cs="Times New Roman"/>
+        </w:rPr>
+        <w:t>ceil</w:t>
+      </w:r>
+      <w:proofErr w:type="spellEnd"/>
+      <w:r>
+        <w:rPr>
+          <w:rFonts w:ascii="Times New Roman" w:hAnsi="Times New Roman" w:cs="Times New Roman"/>
+        </w:rPr>
+        <w:t xml:space="preserve">(log2(9)) = 4 bits </w:t>
+      </w:r>
+      <w:r>
+        <w:rPr>
+          <w:rFonts w:ascii="Times New Roman" w:hAnsi="Times New Roman" w:cs="Times New Roman"/>
+        </w:rPr>
+        <w:t xml:space="preserve">que </w:t>
+      </w:r>
+      <w:r>
+        <w:rPr>
+          <w:rFonts w:ascii="Times New Roman" w:hAnsi="Times New Roman" w:cs="Times New Roman"/>
+        </w:rPr>
+        <w:t>introducen mayor desperdicio relativo. El</w:t>
+      </w:r>
+      <w:r>
+        <w:rPr>
+          <w:rFonts w:ascii="Times New Roman" w:hAnsi="Times New Roman" w:cs="Times New Roman"/>
+        </w:rPr>
+        <w:t xml:space="preserve"> porcentaje de eficiencia perdida</w:t>
+      </w:r>
+      <w:r>
+        <w:rPr>
+          <w:rFonts w:ascii="Times New Roman" w:hAnsi="Times New Roman" w:cs="Times New Roman"/>
+        </w:rPr>
+        <w:t xml:space="preserve"> combina ambos efectos — cuánto del </w:t>
+      </w:r>
+      <w:proofErr w:type="spellStart"/>
+      <w:r>
+        <w:rPr>
+          <w:rFonts w:ascii="Times New Roman" w:hAnsi="Times New Roman" w:cs="Times New Roman"/>
+        </w:rPr>
+        <w:t>bitstream</w:t>
+      </w:r>
+      <w:proofErr w:type="spellEnd"/>
+      <w:r>
+        <w:rPr>
+          <w:rFonts w:ascii="Times New Roman" w:hAnsi="Times New Roman" w:cs="Times New Roman"/>
+        </w:rPr>
+        <w:t xml:space="preserve"> son </w:t>
+      </w:r>
+      <w:r>
+        <w:rPr>
+          <w:rFonts w:ascii="Times New Roman" w:hAnsi="Times New Roman" w:cs="Times New Roman"/>
+        </w:rPr>
+        <w:t>valores crudos</w:t>
+      </w:r>
+      <w:r>
+        <w:rPr>
+          <w:rFonts w:ascii="Times New Roman" w:hAnsi="Times New Roman" w:cs="Times New Roman"/>
+        </w:rPr>
+        <w:t xml:space="preserve"> y cuán ineficientemente se transmiten — representando el porcentaje del </w:t>
+      </w:r>
+      <w:proofErr w:type="spellStart"/>
+      <w:r>
+        <w:rPr>
+          <w:rFonts w:ascii="Times New Roman" w:hAnsi="Times New Roman" w:cs="Times New Roman"/>
+        </w:rPr>
+        <w:t>bpp_final</w:t>
+      </w:r>
+      <w:proofErr w:type="spellEnd"/>
+      <w:r>
+        <w:rPr>
+          <w:rFonts w:ascii="Times New Roman" w:hAnsi="Times New Roman" w:cs="Times New Roman"/>
+        </w:rPr>
+        <w:t xml:space="preserve"> que se desperdicia en total. Este es mayor para 17 clases (9.89%) que para 32 clases (3.79%), lo que significa que, aunque con 32 clases hay muchos </w:t>
+      </w:r>
+      <w:r>
+        <w:rPr>
+          <w:rFonts w:ascii="Times New Roman" w:hAnsi="Times New Roman" w:cs="Times New Roman"/>
+        </w:rPr>
+        <w:t xml:space="preserve">más </w:t>
+      </w:r>
+      <w:r>
+        <w:rPr>
+          <w:rFonts w:ascii="Times New Roman" w:hAnsi="Times New Roman" w:cs="Times New Roman"/>
+        </w:rPr>
+        <w:t>valores crudos</w:t>
+      </w:r>
+      <w:r>
+        <w:rPr>
+          <w:rFonts w:ascii="Times New Roman" w:hAnsi="Times New Roman" w:cs="Times New Roman"/>
+        </w:rPr>
+        <w:t xml:space="preserve">, el desperdicio real sobre el </w:t>
+      </w:r>
+      <w:proofErr w:type="spellStart"/>
+      <w:r>
+        <w:rPr>
+          <w:rFonts w:ascii="Times New Roman" w:hAnsi="Times New Roman" w:cs="Times New Roman"/>
+        </w:rPr>
+        <w:t>bitstream</w:t>
+      </w:r>
+      <w:proofErr w:type="spellEnd"/>
+      <w:r>
+        <w:rPr>
+          <w:rFonts w:ascii="Times New Roman" w:hAnsi="Times New Roman" w:cs="Times New Roman"/>
+        </w:rPr>
+        <w:t xml:space="preserve"> total es menor porque cada valor crudo se transmite con menos </w:t>
+      </w:r>
+      <w:proofErr w:type="spellStart"/>
+      <w:r>
+        <w:rPr>
+          <w:rFonts w:ascii="Times New Roman" w:hAnsi="Times New Roman" w:cs="Times New Roman"/>
+        </w:rPr>
+        <w:t>overhead</w:t>
+      </w:r>
+      <w:proofErr w:type="spellEnd"/>
+      <w:r>
+        <w:rPr>
+          <w:rFonts w:ascii="Times New Roman" w:hAnsi="Times New Roman" w:cs="Times New Roman"/>
+        </w:rPr>
+        <w:t xml:space="preserve"> relativo. Por tanto, el problema principal con 32 clases no es la ineficiencia de transmitir los </w:t>
+      </w:r>
+      <w:r>
+        <w:rPr>
+          <w:rFonts w:ascii="Times New Roman" w:hAnsi="Times New Roman" w:cs="Times New Roman"/>
+        </w:rPr>
+        <w:t>valores crudos</w:t>
+      </w:r>
+      <w:r>
+        <w:rPr>
+          <w:rFonts w:ascii="Times New Roman" w:hAnsi="Times New Roman" w:cs="Times New Roman"/>
+        </w:rPr>
+        <w:t xml:space="preserve"> sino su alta frecuencia — el 45.84% del </w:t>
+      </w:r>
+      <w:proofErr w:type="spellStart"/>
+      <w:r>
+        <w:rPr>
+          <w:rFonts w:ascii="Times New Roman" w:hAnsi="Times New Roman" w:cs="Times New Roman"/>
+        </w:rPr>
+        <w:t>bitstream</w:t>
+      </w:r>
+      <w:proofErr w:type="spellEnd"/>
+      <w:r>
+        <w:rPr>
+          <w:rFonts w:ascii="Times New Roman" w:hAnsi="Times New Roman" w:cs="Times New Roman"/>
+        </w:rPr>
+        <w:t xml:space="preserve"> son valores crudos que el predictor no pudo resolver, independientemente de cuán eficientemente se transmitan.</w:t>
       </w:r>
     </w:p>
     <w:sectPr>
@@ -4065,11 +4508,195 @@
       </w:rPr>
     </w:lvl>
   </w:abstractNum>
+  <w:abstractNum w:abstractNumId="2" w15:restartNumberingAfterBreak="0">
+    <w:nsid w:val="6F590C07"/>
+    <w:multiLevelType w:val="hybridMultilevel"/>
+    <w:tmpl w:val="81C49C06"/>
+    <w:lvl w:ilvl="0" w:tplc="0C0A000F">
+      <w:start w:val="1"/>
+      <w:numFmt w:val="decimal"/>
+      <w:lvlText w:val="%1."/>
+      <w:lvlJc w:val="left"/>
+      <w:pPr>
+        <w:ind w:left="720" w:hanging="360"/>
+      </w:pPr>
+      <w:rPr>
+        <w:rFonts w:hint="default"/>
+      </w:rPr>
+    </w:lvl>
+    <w:lvl w:ilvl="1" w:tplc="0C0A0019" w:tentative="1">
+      <w:start w:val="1"/>
+      <w:numFmt w:val="lowerLetter"/>
+      <w:lvlText w:val="%2."/>
+      <w:lvlJc w:val="left"/>
+      <w:pPr>
+        <w:ind w:left="1440" w:hanging="360"/>
+      </w:pPr>
+    </w:lvl>
+    <w:lvl w:ilvl="2" w:tplc="0C0A001B" w:tentative="1">
+      <w:start w:val="1"/>
+      <w:numFmt w:val="lowerRoman"/>
+      <w:lvlText w:val="%3."/>
+      <w:lvlJc w:val="right"/>
+      <w:pPr>
+        <w:ind w:left="2160" w:hanging="180"/>
+      </w:pPr>
+    </w:lvl>
+    <w:lvl w:ilvl="3" w:tplc="0C0A000F" w:tentative="1">
+      <w:start w:val="1"/>
+      <w:numFmt w:val="decimal"/>
+      <w:lvlText w:val="%4."/>
+      <w:lvlJc w:val="left"/>
+      <w:pPr>
+        <w:ind w:left="2880" w:hanging="360"/>
+      </w:pPr>
+    </w:lvl>
+    <w:lvl w:ilvl="4" w:tplc="0C0A0019" w:tentative="1">
+      <w:start w:val="1"/>
+      <w:numFmt w:val="lowerLetter"/>
+      <w:lvlText w:val="%5."/>
+      <w:lvlJc w:val="left"/>
+      <w:pPr>
+        <w:ind w:left="3600" w:hanging="360"/>
+      </w:pPr>
+    </w:lvl>
+    <w:lvl w:ilvl="5" w:tplc="0C0A001B" w:tentative="1">
+      <w:start w:val="1"/>
+      <w:numFmt w:val="lowerRoman"/>
+      <w:lvlText w:val="%6."/>
+      <w:lvlJc w:val="right"/>
+      <w:pPr>
+        <w:ind w:left="4320" w:hanging="180"/>
+      </w:pPr>
+    </w:lvl>
+    <w:lvl w:ilvl="6" w:tplc="0C0A000F" w:tentative="1">
+      <w:start w:val="1"/>
+      <w:numFmt w:val="decimal"/>
+      <w:lvlText w:val="%7."/>
+      <w:lvlJc w:val="left"/>
+      <w:pPr>
+        <w:ind w:left="5040" w:hanging="360"/>
+      </w:pPr>
+    </w:lvl>
+    <w:lvl w:ilvl="7" w:tplc="0C0A0019" w:tentative="1">
+      <w:start w:val="1"/>
+      <w:numFmt w:val="lowerLetter"/>
+      <w:lvlText w:val="%8."/>
+      <w:lvlJc w:val="left"/>
+      <w:pPr>
+        <w:ind w:left="5760" w:hanging="360"/>
+      </w:pPr>
+    </w:lvl>
+    <w:lvl w:ilvl="8" w:tplc="0C0A001B" w:tentative="1">
+      <w:start w:val="1"/>
+      <w:numFmt w:val="lowerRoman"/>
+      <w:lvlText w:val="%9."/>
+      <w:lvlJc w:val="right"/>
+      <w:pPr>
+        <w:ind w:left="6480" w:hanging="180"/>
+      </w:pPr>
+    </w:lvl>
+  </w:abstractNum>
+  <w:abstractNum w:abstractNumId="3" w15:restartNumberingAfterBreak="0">
+    <w:nsid w:val="7C8D7920"/>
+    <w:multiLevelType w:val="hybridMultilevel"/>
+    <w:tmpl w:val="C6B6D172"/>
+    <w:lvl w:ilvl="0" w:tplc="0C0A000F">
+      <w:start w:val="1"/>
+      <w:numFmt w:val="decimal"/>
+      <w:lvlText w:val="%1."/>
+      <w:lvlJc w:val="left"/>
+      <w:pPr>
+        <w:ind w:left="720" w:hanging="360"/>
+      </w:pPr>
+      <w:rPr>
+        <w:rFonts w:hint="default"/>
+      </w:rPr>
+    </w:lvl>
+    <w:lvl w:ilvl="1" w:tplc="0C0A0019" w:tentative="1">
+      <w:start w:val="1"/>
+      <w:numFmt w:val="lowerLetter"/>
+      <w:lvlText w:val="%2."/>
+      <w:lvlJc w:val="left"/>
+      <w:pPr>
+        <w:ind w:left="1440" w:hanging="360"/>
+      </w:pPr>
+    </w:lvl>
+    <w:lvl w:ilvl="2" w:tplc="0C0A001B" w:tentative="1">
+      <w:start w:val="1"/>
+      <w:numFmt w:val="lowerRoman"/>
+      <w:lvlText w:val="%3."/>
+      <w:lvlJc w:val="right"/>
+      <w:pPr>
+        <w:ind w:left="2160" w:hanging="180"/>
+      </w:pPr>
+    </w:lvl>
+    <w:lvl w:ilvl="3" w:tplc="0C0A000F" w:tentative="1">
+      <w:start w:val="1"/>
+      <w:numFmt w:val="decimal"/>
+      <w:lvlText w:val="%4."/>
+      <w:lvlJc w:val="left"/>
+      <w:pPr>
+        <w:ind w:left="2880" w:hanging="360"/>
+      </w:pPr>
+    </w:lvl>
+    <w:lvl w:ilvl="4" w:tplc="0C0A0019" w:tentative="1">
+      <w:start w:val="1"/>
+      <w:numFmt w:val="lowerLetter"/>
+      <w:lvlText w:val="%5."/>
+      <w:lvlJc w:val="left"/>
+      <w:pPr>
+        <w:ind w:left="3600" w:hanging="360"/>
+      </w:pPr>
+    </w:lvl>
+    <w:lvl w:ilvl="5" w:tplc="0C0A001B" w:tentative="1">
+      <w:start w:val="1"/>
+      <w:numFmt w:val="lowerRoman"/>
+      <w:lvlText w:val="%6."/>
+      <w:lvlJc w:val="right"/>
+      <w:pPr>
+        <w:ind w:left="4320" w:hanging="180"/>
+      </w:pPr>
+    </w:lvl>
+    <w:lvl w:ilvl="6" w:tplc="0C0A000F" w:tentative="1">
+      <w:start w:val="1"/>
+      <w:numFmt w:val="decimal"/>
+      <w:lvlText w:val="%7."/>
+      <w:lvlJc w:val="left"/>
+      <w:pPr>
+        <w:ind w:left="5040" w:hanging="360"/>
+      </w:pPr>
+    </w:lvl>
+    <w:lvl w:ilvl="7" w:tplc="0C0A0019" w:tentative="1">
+      <w:start w:val="1"/>
+      <w:numFmt w:val="lowerLetter"/>
+      <w:lvlText w:val="%8."/>
+      <w:lvlJc w:val="left"/>
+      <w:pPr>
+        <w:ind w:left="5760" w:hanging="360"/>
+      </w:pPr>
+    </w:lvl>
+    <w:lvl w:ilvl="8" w:tplc="0C0A001B" w:tentative="1">
+      <w:start w:val="1"/>
+      <w:numFmt w:val="lowerRoman"/>
+      <w:lvlText w:val="%9."/>
+      <w:lvlJc w:val="right"/>
+      <w:pPr>
+        <w:ind w:left="6480" w:hanging="180"/>
+      </w:pPr>
+    </w:lvl>
+  </w:abstractNum>
   <w:num w:numId="1" w16cid:durableId="23672323">
     <w:abstractNumId w:val="0"/>
   </w:num>
   <w:num w:numId="2" w16cid:durableId="579221542">
     <w:abstractNumId w:val="1"/>
+  </w:num>
+  <w:num w:numId="3" w16cid:durableId="2103379566">
+    <w:abstractNumId w:val="3"/>
+  </w:num>
+  <w:num w:numId="4" w16cid:durableId="982541450">
+    <w:abstractNumId w:val="2"/>
   </w:num>
 </w:numbering>
 </file>

</xml_diff>